<commit_message>
Added work done on Andriller
</commit_message>
<xml_diff>
--- a/ReportsAndDocuments/F25_4440_G12_worklogs.docx
+++ b/ReportsAndDocuments/F25_4440_G12_worklogs.docx
@@ -1,6 +1,6 @@
 
 <file path=word/document.xml><?xml version="1.0" encoding="utf-8"?>
-<w:document xmlns:wpc="http://schemas.microsoft.com/office/word/2010/wordprocessingCanvas" xmlns:cx="http://schemas.microsoft.com/office/drawing/2014/chartex" xmlns:cx1="http://schemas.microsoft.com/office/drawing/2015/9/8/chartex" xmlns:cx2="http://schemas.microsoft.com/office/drawing/2015/10/21/chartex" xmlns:cx3="http://schemas.microsoft.com/office/drawing/2016/5/9/chartex" xmlns:cx4="http://schemas.microsoft.com/office/drawing/2016/5/10/chartex" xmlns:cx5="http://schemas.microsoft.com/office/drawing/2016/5/11/chartex" xmlns:cx6="http://schemas.microsoft.com/office/drawing/2016/5/12/chartex" xmlns:cx7="http://schemas.microsoft.com/office/drawing/2016/5/13/chartex" xmlns:cx8="http://schemas.microsoft.com/office/drawing/2016/5/14/chartex" xmlns:mc="http://schemas.openxmlformats.org/markup-compatibility/2006" xmlns:aink="http://schemas.microsoft.com/office/drawing/2016/ink" xmlns:am3d="http://schemas.microsoft.com/office/drawing/2017/model3d" xmlns:o="urn:schemas-microsoft-com:office:office" xmlns:oel="http://schemas.microsoft.com/office/2019/extlst" xmlns:r="http://schemas.openxmlformats.org/officeDocument/2006/relationships" xmlns:m="http://schemas.openxmlformats.org/officeDocument/2006/math" xmlns:v="urn:schemas-microsoft-com:vml" xmlns:wp14="http://schemas.microsoft.com/office/word/2010/wordprocessingDrawing" xmlns:wp="http://schemas.openxmlformats.org/drawingml/2006/wordprocessingDrawing" xmlns:w10="urn:schemas-microsoft-com:office:word" xmlns:w="http://schemas.openxmlformats.org/wordprocessingml/2006/main" xmlns:w14="http://schemas.microsoft.com/office/word/2010/wordml" xmlns:w15="http://schemas.microsoft.com/office/word/2012/wordml" xmlns:w16cex="http://schemas.microsoft.com/office/word/2018/wordml/cex" xmlns:w16cid="http://schemas.microsoft.com/office/word/2016/wordml/cid" xmlns:w16="http://schemas.microsoft.com/office/word/2018/wordml" xmlns:w16du="http://schemas.microsoft.com/office/word/2023/wordml/word16du" xmlns:w16sdtdh="http://schemas.microsoft.com/office/word/2020/wordml/sdtdatahash" xmlns:w16sdtfl="http://schemas.microsoft.com/office/word/2024/wordml/sdtformatlock" xmlns:w16se="http://schemas.microsoft.com/office/word/2015/wordml/symex" xmlns:wpg="http://schemas.microsoft.com/office/word/2010/wordprocessingGroup" xmlns:wpi="http://schemas.microsoft.com/office/word/2010/wordprocessingInk" xmlns:wne="http://schemas.microsoft.com/office/word/2006/wordml" xmlns:wps="http://schemas.microsoft.com/office/word/2010/wordprocessingShape" mc:Ignorable="w14 w15 w16se w16cid w16 w16cex w16sdtdh w16sdtfl w16du wp14">
+<w:document xmlns:wpc="http://schemas.microsoft.com/office/word/2010/wordprocessingCanvas" xmlns:cx="http://schemas.microsoft.com/office/drawing/2014/chartex" xmlns:cx1="http://schemas.microsoft.com/office/drawing/2015/9/8/chartex" xmlns:cx2="http://schemas.microsoft.com/office/drawing/2015/10/21/chartex" xmlns:cx3="http://schemas.microsoft.com/office/drawing/2016/5/9/chartex" xmlns:cx4="http://schemas.microsoft.com/office/drawing/2016/5/10/chartex" xmlns:cx5="http://schemas.microsoft.com/office/drawing/2016/5/11/chartex" xmlns:cx6="http://schemas.microsoft.com/office/drawing/2016/5/12/chartex" xmlns:cx7="http://schemas.microsoft.com/office/drawing/2016/5/13/chartex" xmlns:cx8="http://schemas.microsoft.com/office/drawing/2016/5/14/chartex" xmlns:mc="http://schemas.openxmlformats.org/markup-compatibility/2006" xmlns:aink="http://schemas.microsoft.com/office/drawing/2016/ink" xmlns:am3d="http://schemas.microsoft.com/office/drawing/2017/model3d" xmlns:o="urn:schemas-microsoft-com:office:office" xmlns:oel="http://schemas.microsoft.com/office/2019/extlst" xmlns:r="http://schemas.openxmlformats.org/officeDocument/2006/relationships" xmlns:m="http://schemas.openxmlformats.org/officeDocument/2006/math" xmlns:v="urn:schemas-microsoft-com:vml" xmlns:wp14="http://schemas.microsoft.com/office/word/2010/wordprocessingDrawing" xmlns:wp="http://schemas.openxmlformats.org/drawingml/2006/wordprocessingDrawing" xmlns:w10="urn:schemas-microsoft-com:office:word" xmlns:w="http://schemas.openxmlformats.org/wordprocessingml/2006/main" xmlns:w14="http://schemas.microsoft.com/office/word/2010/wordml" xmlns:w15="http://schemas.microsoft.com/office/word/2012/wordml" xmlns:w16cex="http://schemas.microsoft.com/office/word/2018/wordml/cex" xmlns:w16cid="http://schemas.microsoft.com/office/word/2016/wordml/cid" xmlns:w16="http://schemas.microsoft.com/office/word/2018/wordml" xmlns:w16sdtdh="http://schemas.microsoft.com/office/word/2020/wordml/sdtdatahash" xmlns:w16se="http://schemas.microsoft.com/office/word/2015/wordml/symex" xmlns:wpg="http://schemas.microsoft.com/office/word/2010/wordprocessingGroup" xmlns:wpi="http://schemas.microsoft.com/office/word/2010/wordprocessingInk" xmlns:wne="http://schemas.microsoft.com/office/word/2006/wordml" xmlns:wps="http://schemas.microsoft.com/office/word/2010/wordprocessingShape" mc:Ignorable="w14 w15 w16se w16cid w16 w16cex w16sdtdh wp14">
   <w:body>
     <w:sdt>
       <w:sdtPr>
@@ -122,7 +122,7 @@
               <w:noProof/>
             </w:rPr>
             <w:drawing>
-              <wp:inline distT="0" distB="0" distL="0" distR="0" wp14:anchorId="57354EC8" wp14:editId="511A2DFC">
+              <wp:inline distT="0" distB="0" distL="0" distR="0" wp14:anchorId="57354EC8" wp14:editId="38BA7FE6">
                 <wp:extent cx="828675" cy="828675"/>
                 <wp:effectExtent l="0" t="0" r="9525" b="9525"/>
                 <wp:docPr id="14" name="Picture 14"/>
@@ -233,7 +233,6 @@
             </w:rPr>
             <w:t xml:space="preserve"> </w:t>
           </w:r>
-          <w:proofErr w:type="gramStart"/>
           <w:r>
             <w:rPr>
               <w:b/>
@@ -248,11 +247,7 @@
             <w:t xml:space="preserve"> </w:t>
           </w:r>
           <w:r>
-            <w:t>–</w:t>
-          </w:r>
-          <w:proofErr w:type="gramEnd"/>
-          <w:r>
-            <w:t xml:space="preserve"> </w:t>
+            <w:t xml:space="preserve">– </w:t>
           </w:r>
           <w:r>
             <w:t xml:space="preserve"> </w:t>
@@ -747,6 +742,9 @@
             <w:r>
               <w:t xml:space="preserve"> </w:t>
             </w:r>
+            <w:r>
+              <w:t>Research on Novel Tool</w:t>
+            </w:r>
           </w:p>
         </w:tc>
       </w:tr>
@@ -780,7 +778,11 @@
           <w:tcPr>
             <w:tcW w:w="3685" w:type="dxa"/>
           </w:tcPr>
-          <w:p/>
+          <w:p>
+            <w:r>
+              <w:t xml:space="preserve">Started MVT </w:t>
+            </w:r>
+          </w:p>
         </w:tc>
       </w:tr>
       <w:tr>
@@ -1307,7 +1309,20 @@
           <w:tcPr>
             <w:tcW w:w="1413" w:type="dxa"/>
           </w:tcPr>
-          <w:p/>
+          <w:p>
+            <w:r>
+              <w:t>Nov 5</w:t>
+            </w:r>
+            <w:r>
+              <w:rPr>
+                <w:vertAlign w:val="superscript"/>
+              </w:rPr>
+              <w:t>th</w:t>
+            </w:r>
+            <w:r>
+              <w:t xml:space="preserve"> </w:t>
+            </w:r>
+          </w:p>
         </w:tc>
         <w:tc>
           <w:tcPr>
@@ -1340,7 +1355,20 @@
           <w:tcPr>
             <w:tcW w:w="1413" w:type="dxa"/>
           </w:tcPr>
-          <w:p/>
+          <w:p>
+            <w:r>
+              <w:t>Nov 6</w:t>
+            </w:r>
+            <w:r>
+              <w:rPr>
+                <w:vertAlign w:val="superscript"/>
+              </w:rPr>
+              <w:t>th</w:t>
+            </w:r>
+            <w:r>
+              <w:t xml:space="preserve"> </w:t>
+            </w:r>
+          </w:p>
         </w:tc>
         <w:tc>
           <w:tcPr>
@@ -1385,7 +1413,7 @@
 </file>
 
 <file path=word/endnotes.xml><?xml version="1.0" encoding="utf-8"?>
-<w:endnotes xmlns:wpc="http://schemas.microsoft.com/office/word/2010/wordprocessingCanvas" xmlns:cx="http://schemas.microsoft.com/office/drawing/2014/chartex" xmlns:cx1="http://schemas.microsoft.com/office/drawing/2015/9/8/chartex" xmlns:cx2="http://schemas.microsoft.com/office/drawing/2015/10/21/chartex" xmlns:cx3="http://schemas.microsoft.com/office/drawing/2016/5/9/chartex" xmlns:cx4="http://schemas.microsoft.com/office/drawing/2016/5/10/chartex" xmlns:cx5="http://schemas.microsoft.com/office/drawing/2016/5/11/chartex" xmlns:cx6="http://schemas.microsoft.com/office/drawing/2016/5/12/chartex" xmlns:cx7="http://schemas.microsoft.com/office/drawing/2016/5/13/chartex" xmlns:cx8="http://schemas.microsoft.com/office/drawing/2016/5/14/chartex" xmlns:mc="http://schemas.openxmlformats.org/markup-compatibility/2006" xmlns:aink="http://schemas.microsoft.com/office/drawing/2016/ink" xmlns:am3d="http://schemas.microsoft.com/office/drawing/2017/model3d" xmlns:o="urn:schemas-microsoft-com:office:office" xmlns:oel="http://schemas.microsoft.com/office/2019/extlst" xmlns:r="http://schemas.openxmlformats.org/officeDocument/2006/relationships" xmlns:m="http://schemas.openxmlformats.org/officeDocument/2006/math" xmlns:v="urn:schemas-microsoft-com:vml" xmlns:wp14="http://schemas.microsoft.com/office/word/2010/wordprocessingDrawing" xmlns:wp="http://schemas.openxmlformats.org/drawingml/2006/wordprocessingDrawing" xmlns:w10="urn:schemas-microsoft-com:office:word" xmlns:w="http://schemas.openxmlformats.org/wordprocessingml/2006/main" xmlns:w14="http://schemas.microsoft.com/office/word/2010/wordml" xmlns:w15="http://schemas.microsoft.com/office/word/2012/wordml" xmlns:w16cex="http://schemas.microsoft.com/office/word/2018/wordml/cex" xmlns:w16cid="http://schemas.microsoft.com/office/word/2016/wordml/cid" xmlns:w16="http://schemas.microsoft.com/office/word/2018/wordml" xmlns:w16du="http://schemas.microsoft.com/office/word/2023/wordml/word16du" xmlns:w16sdtdh="http://schemas.microsoft.com/office/word/2020/wordml/sdtdatahash" xmlns:w16sdtfl="http://schemas.microsoft.com/office/word/2024/wordml/sdtformatlock" xmlns:w16se="http://schemas.microsoft.com/office/word/2015/wordml/symex" xmlns:wpg="http://schemas.microsoft.com/office/word/2010/wordprocessingGroup" xmlns:wpi="http://schemas.microsoft.com/office/word/2010/wordprocessingInk" xmlns:wne="http://schemas.microsoft.com/office/word/2006/wordml" xmlns:wps="http://schemas.microsoft.com/office/word/2010/wordprocessingShape" mc:Ignorable="w14 w15 w16se w16cid w16 w16cex w16sdtdh w16sdtfl w16du wp14">
+<w:endnotes xmlns:wpc="http://schemas.microsoft.com/office/word/2010/wordprocessingCanvas" xmlns:cx="http://schemas.microsoft.com/office/drawing/2014/chartex" xmlns:cx1="http://schemas.microsoft.com/office/drawing/2015/9/8/chartex" xmlns:cx2="http://schemas.microsoft.com/office/drawing/2015/10/21/chartex" xmlns:cx3="http://schemas.microsoft.com/office/drawing/2016/5/9/chartex" xmlns:cx4="http://schemas.microsoft.com/office/drawing/2016/5/10/chartex" xmlns:cx5="http://schemas.microsoft.com/office/drawing/2016/5/11/chartex" xmlns:cx6="http://schemas.microsoft.com/office/drawing/2016/5/12/chartex" xmlns:cx7="http://schemas.microsoft.com/office/drawing/2016/5/13/chartex" xmlns:cx8="http://schemas.microsoft.com/office/drawing/2016/5/14/chartex" xmlns:mc="http://schemas.openxmlformats.org/markup-compatibility/2006" xmlns:aink="http://schemas.microsoft.com/office/drawing/2016/ink" xmlns:am3d="http://schemas.microsoft.com/office/drawing/2017/model3d" xmlns:o="urn:schemas-microsoft-com:office:office" xmlns:oel="http://schemas.microsoft.com/office/2019/extlst" xmlns:r="http://schemas.openxmlformats.org/officeDocument/2006/relationships" xmlns:m="http://schemas.openxmlformats.org/officeDocument/2006/math" xmlns:v="urn:schemas-microsoft-com:vml" xmlns:wp14="http://schemas.microsoft.com/office/word/2010/wordprocessingDrawing" xmlns:wp="http://schemas.openxmlformats.org/drawingml/2006/wordprocessingDrawing" xmlns:w10="urn:schemas-microsoft-com:office:word" xmlns:w="http://schemas.openxmlformats.org/wordprocessingml/2006/main" xmlns:w14="http://schemas.microsoft.com/office/word/2010/wordml" xmlns:w15="http://schemas.microsoft.com/office/word/2012/wordml" xmlns:w16cex="http://schemas.microsoft.com/office/word/2018/wordml/cex" xmlns:w16cid="http://schemas.microsoft.com/office/word/2016/wordml/cid" xmlns:w16="http://schemas.microsoft.com/office/word/2018/wordml" xmlns:w16sdtdh="http://schemas.microsoft.com/office/word/2020/wordml/sdtdatahash" xmlns:w16se="http://schemas.microsoft.com/office/word/2015/wordml/symex" xmlns:wpg="http://schemas.microsoft.com/office/word/2010/wordprocessingGroup" xmlns:wpi="http://schemas.microsoft.com/office/word/2010/wordprocessingInk" xmlns:wne="http://schemas.microsoft.com/office/word/2006/wordml" xmlns:wps="http://schemas.microsoft.com/office/word/2010/wordprocessingShape" mc:Ignorable="w14 w15 w16se w16cid w16 w16cex w16sdtdh wp14">
   <w:endnote w:type="separator" w:id="-1">
     <w:p>
       <w:pPr>
@@ -1410,7 +1438,7 @@
 </file>
 
 <file path=word/footer1.xml><?xml version="1.0" encoding="utf-8"?>
-<w:ftr xmlns:wpc="http://schemas.microsoft.com/office/word/2010/wordprocessingCanvas" xmlns:cx="http://schemas.microsoft.com/office/drawing/2014/chartex" xmlns:cx1="http://schemas.microsoft.com/office/drawing/2015/9/8/chartex" xmlns:cx2="http://schemas.microsoft.com/office/drawing/2015/10/21/chartex" xmlns:cx3="http://schemas.microsoft.com/office/drawing/2016/5/9/chartex" xmlns:cx4="http://schemas.microsoft.com/office/drawing/2016/5/10/chartex" xmlns:cx5="http://schemas.microsoft.com/office/drawing/2016/5/11/chartex" xmlns:cx6="http://schemas.microsoft.com/office/drawing/2016/5/12/chartex" xmlns:cx7="http://schemas.microsoft.com/office/drawing/2016/5/13/chartex" xmlns:cx8="http://schemas.microsoft.com/office/drawing/2016/5/14/chartex" xmlns:mc="http://schemas.openxmlformats.org/markup-compatibility/2006" xmlns:aink="http://schemas.microsoft.com/office/drawing/2016/ink" xmlns:am3d="http://schemas.microsoft.com/office/drawing/2017/model3d" xmlns:o="urn:schemas-microsoft-com:office:office" xmlns:oel="http://schemas.microsoft.com/office/2019/extlst" xmlns:r="http://schemas.openxmlformats.org/officeDocument/2006/relationships" xmlns:m="http://schemas.openxmlformats.org/officeDocument/2006/math" xmlns:v="urn:schemas-microsoft-com:vml" xmlns:wp14="http://schemas.microsoft.com/office/word/2010/wordprocessingDrawing" xmlns:wp="http://schemas.openxmlformats.org/drawingml/2006/wordprocessingDrawing" xmlns:w10="urn:schemas-microsoft-com:office:word" xmlns:w="http://schemas.openxmlformats.org/wordprocessingml/2006/main" xmlns:w14="http://schemas.microsoft.com/office/word/2010/wordml" xmlns:w15="http://schemas.microsoft.com/office/word/2012/wordml" xmlns:w16cex="http://schemas.microsoft.com/office/word/2018/wordml/cex" xmlns:w16cid="http://schemas.microsoft.com/office/word/2016/wordml/cid" xmlns:w16="http://schemas.microsoft.com/office/word/2018/wordml" xmlns:w16du="http://schemas.microsoft.com/office/word/2023/wordml/word16du" xmlns:w16sdtdh="http://schemas.microsoft.com/office/word/2020/wordml/sdtdatahash" xmlns:w16sdtfl="http://schemas.microsoft.com/office/word/2024/wordml/sdtformatlock" xmlns:w16se="http://schemas.microsoft.com/office/word/2015/wordml/symex" xmlns:wpg="http://schemas.microsoft.com/office/word/2010/wordprocessingGroup" xmlns:wpi="http://schemas.microsoft.com/office/word/2010/wordprocessingInk" xmlns:wne="http://schemas.microsoft.com/office/word/2006/wordml" xmlns:wps="http://schemas.microsoft.com/office/word/2010/wordprocessingShape" mc:Ignorable="w14 w15 w16se w16cid w16 w16cex w16sdtdh w16sdtfl w16du wp14">
+<w:ftr xmlns:wpc="http://schemas.microsoft.com/office/word/2010/wordprocessingCanvas" xmlns:cx="http://schemas.microsoft.com/office/drawing/2014/chartex" xmlns:cx1="http://schemas.microsoft.com/office/drawing/2015/9/8/chartex" xmlns:cx2="http://schemas.microsoft.com/office/drawing/2015/10/21/chartex" xmlns:cx3="http://schemas.microsoft.com/office/drawing/2016/5/9/chartex" xmlns:cx4="http://schemas.microsoft.com/office/drawing/2016/5/10/chartex" xmlns:cx5="http://schemas.microsoft.com/office/drawing/2016/5/11/chartex" xmlns:cx6="http://schemas.microsoft.com/office/drawing/2016/5/12/chartex" xmlns:cx7="http://schemas.microsoft.com/office/drawing/2016/5/13/chartex" xmlns:cx8="http://schemas.microsoft.com/office/drawing/2016/5/14/chartex" xmlns:mc="http://schemas.openxmlformats.org/markup-compatibility/2006" xmlns:aink="http://schemas.microsoft.com/office/drawing/2016/ink" xmlns:am3d="http://schemas.microsoft.com/office/drawing/2017/model3d" xmlns:o="urn:schemas-microsoft-com:office:office" xmlns:oel="http://schemas.microsoft.com/office/2019/extlst" xmlns:r="http://schemas.openxmlformats.org/officeDocument/2006/relationships" xmlns:m="http://schemas.openxmlformats.org/officeDocument/2006/math" xmlns:v="urn:schemas-microsoft-com:vml" xmlns:wp14="http://schemas.microsoft.com/office/word/2010/wordprocessingDrawing" xmlns:wp="http://schemas.openxmlformats.org/drawingml/2006/wordprocessingDrawing" xmlns:w10="urn:schemas-microsoft-com:office:word" xmlns:w="http://schemas.openxmlformats.org/wordprocessingml/2006/main" xmlns:w14="http://schemas.microsoft.com/office/word/2010/wordml" xmlns:w15="http://schemas.microsoft.com/office/word/2012/wordml" xmlns:w16cex="http://schemas.microsoft.com/office/word/2018/wordml/cex" xmlns:w16cid="http://schemas.microsoft.com/office/word/2016/wordml/cid" xmlns:w16="http://schemas.microsoft.com/office/word/2018/wordml" xmlns:w16sdtdh="http://schemas.microsoft.com/office/word/2020/wordml/sdtdatahash" xmlns:w16se="http://schemas.microsoft.com/office/word/2015/wordml/symex" xmlns:wpg="http://schemas.microsoft.com/office/word/2010/wordprocessingGroup" xmlns:wpi="http://schemas.microsoft.com/office/word/2010/wordprocessingInk" xmlns:wne="http://schemas.microsoft.com/office/word/2006/wordml" xmlns:wps="http://schemas.microsoft.com/office/word/2010/wordprocessingShape" mc:Ignorable="w14 w15 w16se w16cid w16 w16cex w16sdtdh wp14">
   <w:p>
     <w:pPr>
       <w:pStyle w:val="Footer"/>
@@ -1496,7 +1524,7 @@
 </file>
 
 <file path=word/footnotes.xml><?xml version="1.0" encoding="utf-8"?>
-<w:footnotes xmlns:wpc="http://schemas.microsoft.com/office/word/2010/wordprocessingCanvas" xmlns:cx="http://schemas.microsoft.com/office/drawing/2014/chartex" xmlns:cx1="http://schemas.microsoft.com/office/drawing/2015/9/8/chartex" xmlns:cx2="http://schemas.microsoft.com/office/drawing/2015/10/21/chartex" xmlns:cx3="http://schemas.microsoft.com/office/drawing/2016/5/9/chartex" xmlns:cx4="http://schemas.microsoft.com/office/drawing/2016/5/10/chartex" xmlns:cx5="http://schemas.microsoft.com/office/drawing/2016/5/11/chartex" xmlns:cx6="http://schemas.microsoft.com/office/drawing/2016/5/12/chartex" xmlns:cx7="http://schemas.microsoft.com/office/drawing/2016/5/13/chartex" xmlns:cx8="http://schemas.microsoft.com/office/drawing/2016/5/14/chartex" xmlns:mc="http://schemas.openxmlformats.org/markup-compatibility/2006" xmlns:aink="http://schemas.microsoft.com/office/drawing/2016/ink" xmlns:am3d="http://schemas.microsoft.com/office/drawing/2017/model3d" xmlns:o="urn:schemas-microsoft-com:office:office" xmlns:oel="http://schemas.microsoft.com/office/2019/extlst" xmlns:r="http://schemas.openxmlformats.org/officeDocument/2006/relationships" xmlns:m="http://schemas.openxmlformats.org/officeDocument/2006/math" xmlns:v="urn:schemas-microsoft-com:vml" xmlns:wp14="http://schemas.microsoft.com/office/word/2010/wordprocessingDrawing" xmlns:wp="http://schemas.openxmlformats.org/drawingml/2006/wordprocessingDrawing" xmlns:w10="urn:schemas-microsoft-com:office:word" xmlns:w="http://schemas.openxmlformats.org/wordprocessingml/2006/main" xmlns:w14="http://schemas.microsoft.com/office/word/2010/wordml" xmlns:w15="http://schemas.microsoft.com/office/word/2012/wordml" xmlns:w16cex="http://schemas.microsoft.com/office/word/2018/wordml/cex" xmlns:w16cid="http://schemas.microsoft.com/office/word/2016/wordml/cid" xmlns:w16="http://schemas.microsoft.com/office/word/2018/wordml" xmlns:w16du="http://schemas.microsoft.com/office/word/2023/wordml/word16du" xmlns:w16sdtdh="http://schemas.microsoft.com/office/word/2020/wordml/sdtdatahash" xmlns:w16sdtfl="http://schemas.microsoft.com/office/word/2024/wordml/sdtformatlock" xmlns:w16se="http://schemas.microsoft.com/office/word/2015/wordml/symex" xmlns:wpg="http://schemas.microsoft.com/office/word/2010/wordprocessingGroup" xmlns:wpi="http://schemas.microsoft.com/office/word/2010/wordprocessingInk" xmlns:wne="http://schemas.microsoft.com/office/word/2006/wordml" xmlns:wps="http://schemas.microsoft.com/office/word/2010/wordprocessingShape" mc:Ignorable="w14 w15 w16se w16cid w16 w16cex w16sdtdh w16sdtfl w16du wp14">
+<w:footnotes xmlns:wpc="http://schemas.microsoft.com/office/word/2010/wordprocessingCanvas" xmlns:cx="http://schemas.microsoft.com/office/drawing/2014/chartex" xmlns:cx1="http://schemas.microsoft.com/office/drawing/2015/9/8/chartex" xmlns:cx2="http://schemas.microsoft.com/office/drawing/2015/10/21/chartex" xmlns:cx3="http://schemas.microsoft.com/office/drawing/2016/5/9/chartex" xmlns:cx4="http://schemas.microsoft.com/office/drawing/2016/5/10/chartex" xmlns:cx5="http://schemas.microsoft.com/office/drawing/2016/5/11/chartex" xmlns:cx6="http://schemas.microsoft.com/office/drawing/2016/5/12/chartex" xmlns:cx7="http://schemas.microsoft.com/office/drawing/2016/5/13/chartex" xmlns:cx8="http://schemas.microsoft.com/office/drawing/2016/5/14/chartex" xmlns:mc="http://schemas.openxmlformats.org/markup-compatibility/2006" xmlns:aink="http://schemas.microsoft.com/office/drawing/2016/ink" xmlns:am3d="http://schemas.microsoft.com/office/drawing/2017/model3d" xmlns:o="urn:schemas-microsoft-com:office:office" xmlns:oel="http://schemas.microsoft.com/office/2019/extlst" xmlns:r="http://schemas.openxmlformats.org/officeDocument/2006/relationships" xmlns:m="http://schemas.openxmlformats.org/officeDocument/2006/math" xmlns:v="urn:schemas-microsoft-com:vml" xmlns:wp14="http://schemas.microsoft.com/office/word/2010/wordprocessingDrawing" xmlns:wp="http://schemas.openxmlformats.org/drawingml/2006/wordprocessingDrawing" xmlns:w10="urn:schemas-microsoft-com:office:word" xmlns:w="http://schemas.openxmlformats.org/wordprocessingml/2006/main" xmlns:w14="http://schemas.microsoft.com/office/word/2010/wordml" xmlns:w15="http://schemas.microsoft.com/office/word/2012/wordml" xmlns:w16cex="http://schemas.microsoft.com/office/word/2018/wordml/cex" xmlns:w16cid="http://schemas.microsoft.com/office/word/2016/wordml/cid" xmlns:w16="http://schemas.microsoft.com/office/word/2018/wordml" xmlns:w16sdtdh="http://schemas.microsoft.com/office/word/2020/wordml/sdtdatahash" xmlns:w16se="http://schemas.microsoft.com/office/word/2015/wordml/symex" xmlns:wpg="http://schemas.microsoft.com/office/word/2010/wordprocessingGroup" xmlns:wpi="http://schemas.microsoft.com/office/word/2010/wordprocessingInk" xmlns:wne="http://schemas.microsoft.com/office/word/2006/wordml" xmlns:wps="http://schemas.microsoft.com/office/word/2010/wordprocessingShape" mc:Ignorable="w14 w15 w16se w16cid w16 w16cex w16sdtdh wp14">
   <w:footnote w:type="separator" w:id="-1">
     <w:p>
       <w:pPr>
@@ -1521,7 +1549,7 @@
 </file>
 
 <file path=word/numbering.xml><?xml version="1.0" encoding="utf-8"?>
-<w:numbering xmlns:wpc="http://schemas.microsoft.com/office/word/2010/wordprocessingCanvas" xmlns:cx="http://schemas.microsoft.com/office/drawing/2014/chartex" xmlns:cx1="http://schemas.microsoft.com/office/drawing/2015/9/8/chartex" xmlns:cx2="http://schemas.microsoft.com/office/drawing/2015/10/21/chartex" xmlns:cx3="http://schemas.microsoft.com/office/drawing/2016/5/9/chartex" xmlns:cx4="http://schemas.microsoft.com/office/drawing/2016/5/10/chartex" xmlns:cx5="http://schemas.microsoft.com/office/drawing/2016/5/11/chartex" xmlns:cx6="http://schemas.microsoft.com/office/drawing/2016/5/12/chartex" xmlns:cx7="http://schemas.microsoft.com/office/drawing/2016/5/13/chartex" xmlns:cx8="http://schemas.microsoft.com/office/drawing/2016/5/14/chartex" xmlns:mc="http://schemas.openxmlformats.org/markup-compatibility/2006" xmlns:aink="http://schemas.microsoft.com/office/drawing/2016/ink" xmlns:am3d="http://schemas.microsoft.com/office/drawing/2017/model3d" xmlns:o="urn:schemas-microsoft-com:office:office" xmlns:oel="http://schemas.microsoft.com/office/2019/extlst" xmlns:r="http://schemas.openxmlformats.org/officeDocument/2006/relationships" xmlns:m="http://schemas.openxmlformats.org/officeDocument/2006/math" xmlns:v="urn:schemas-microsoft-com:vml" xmlns:wp14="http://schemas.microsoft.com/office/word/2010/wordprocessingDrawing" xmlns:wp="http://schemas.openxmlformats.org/drawingml/2006/wordprocessingDrawing" xmlns:w10="urn:schemas-microsoft-com:office:word" xmlns:w="http://schemas.openxmlformats.org/wordprocessingml/2006/main" xmlns:w14="http://schemas.microsoft.com/office/word/2010/wordml" xmlns:w15="http://schemas.microsoft.com/office/word/2012/wordml" xmlns:w16cex="http://schemas.microsoft.com/office/word/2018/wordml/cex" xmlns:w16cid="http://schemas.microsoft.com/office/word/2016/wordml/cid" xmlns:w16="http://schemas.microsoft.com/office/word/2018/wordml" xmlns:w16du="http://schemas.microsoft.com/office/word/2023/wordml/word16du" xmlns:w16sdtdh="http://schemas.microsoft.com/office/word/2020/wordml/sdtdatahash" xmlns:w16sdtfl="http://schemas.microsoft.com/office/word/2024/wordml/sdtformatlock" xmlns:w16se="http://schemas.microsoft.com/office/word/2015/wordml/symex" xmlns:wpg="http://schemas.microsoft.com/office/word/2010/wordprocessingGroup" xmlns:wpi="http://schemas.microsoft.com/office/word/2010/wordprocessingInk" xmlns:wne="http://schemas.microsoft.com/office/word/2006/wordml" xmlns:wps="http://schemas.microsoft.com/office/word/2010/wordprocessingShape" mc:Ignorable="w14 w15 w16se w16cid w16 w16cex w16sdtdh w16sdtfl w16du wp14">
+<w:numbering xmlns:wpc="http://schemas.microsoft.com/office/word/2010/wordprocessingCanvas" xmlns:cx="http://schemas.microsoft.com/office/drawing/2014/chartex" xmlns:cx1="http://schemas.microsoft.com/office/drawing/2015/9/8/chartex" xmlns:cx2="http://schemas.microsoft.com/office/drawing/2015/10/21/chartex" xmlns:cx3="http://schemas.microsoft.com/office/drawing/2016/5/9/chartex" xmlns:cx4="http://schemas.microsoft.com/office/drawing/2016/5/10/chartex" xmlns:cx5="http://schemas.microsoft.com/office/drawing/2016/5/11/chartex" xmlns:cx6="http://schemas.microsoft.com/office/drawing/2016/5/12/chartex" xmlns:cx7="http://schemas.microsoft.com/office/drawing/2016/5/13/chartex" xmlns:cx8="http://schemas.microsoft.com/office/drawing/2016/5/14/chartex" xmlns:mc="http://schemas.openxmlformats.org/markup-compatibility/2006" xmlns:aink="http://schemas.microsoft.com/office/drawing/2016/ink" xmlns:am3d="http://schemas.microsoft.com/office/drawing/2017/model3d" xmlns:o="urn:schemas-microsoft-com:office:office" xmlns:oel="http://schemas.microsoft.com/office/2019/extlst" xmlns:r="http://schemas.openxmlformats.org/officeDocument/2006/relationships" xmlns:m="http://schemas.openxmlformats.org/officeDocument/2006/math" xmlns:v="urn:schemas-microsoft-com:vml" xmlns:wp14="http://schemas.microsoft.com/office/word/2010/wordprocessingDrawing" xmlns:wp="http://schemas.openxmlformats.org/drawingml/2006/wordprocessingDrawing" xmlns:w10="urn:schemas-microsoft-com:office:word" xmlns:w="http://schemas.openxmlformats.org/wordprocessingml/2006/main" xmlns:w14="http://schemas.microsoft.com/office/word/2010/wordml" xmlns:w15="http://schemas.microsoft.com/office/word/2012/wordml" xmlns:w16cex="http://schemas.microsoft.com/office/word/2018/wordml/cex" xmlns:w16cid="http://schemas.microsoft.com/office/word/2016/wordml/cid" xmlns:w16="http://schemas.microsoft.com/office/word/2018/wordml" xmlns:w16sdtdh="http://schemas.microsoft.com/office/word/2020/wordml/sdtdatahash" xmlns:w16se="http://schemas.microsoft.com/office/word/2015/wordml/symex" xmlns:wpg="http://schemas.microsoft.com/office/word/2010/wordprocessingGroup" xmlns:wpi="http://schemas.microsoft.com/office/word/2010/wordprocessingInk" xmlns:wne="http://schemas.microsoft.com/office/word/2006/wordml" xmlns:wps="http://schemas.microsoft.com/office/word/2010/wordprocessingShape" mc:Ignorable="w14 w15 w16se w16cid w16 w16cex w16sdtdh wp14">
   <w:abstractNum w:abstractNumId="0" w15:restartNumberingAfterBreak="0">
     <w:nsid w:val="017E6444"/>
     <w:multiLevelType w:val="multilevel"/>
@@ -23314,7 +23342,7 @@
 </file>
 
 <file path=word/styles.xml><?xml version="1.0" encoding="utf-8"?>
-<w:styles xmlns:mc="http://schemas.openxmlformats.org/markup-compatibility/2006" xmlns:r="http://schemas.openxmlformats.org/officeDocument/2006/relationships" xmlns:w="http://schemas.openxmlformats.org/wordprocessingml/2006/main" xmlns:w14="http://schemas.microsoft.com/office/word/2010/wordml" xmlns:w15="http://schemas.microsoft.com/office/word/2012/wordml" xmlns:w16cex="http://schemas.microsoft.com/office/word/2018/wordml/cex" xmlns:w16cid="http://schemas.microsoft.com/office/word/2016/wordml/cid" xmlns:w16="http://schemas.microsoft.com/office/word/2018/wordml" xmlns:w16du="http://schemas.microsoft.com/office/word/2023/wordml/word16du" xmlns:w16sdtdh="http://schemas.microsoft.com/office/word/2020/wordml/sdtdatahash" xmlns:w16sdtfl="http://schemas.microsoft.com/office/word/2024/wordml/sdtformatlock" xmlns:w16se="http://schemas.microsoft.com/office/word/2015/wordml/symex" mc:Ignorable="w14 w15 w16se w16cid w16 w16cex w16sdtdh w16sdtfl w16du">
+<w:styles xmlns:mc="http://schemas.openxmlformats.org/markup-compatibility/2006" xmlns:r="http://schemas.openxmlformats.org/officeDocument/2006/relationships" xmlns:w="http://schemas.openxmlformats.org/wordprocessingml/2006/main" xmlns:w14="http://schemas.microsoft.com/office/word/2010/wordml" xmlns:w15="http://schemas.microsoft.com/office/word/2012/wordml" xmlns:w16cex="http://schemas.microsoft.com/office/word/2018/wordml/cex" xmlns:w16cid="http://schemas.microsoft.com/office/word/2016/wordml/cid" xmlns:w16="http://schemas.microsoft.com/office/word/2018/wordml" xmlns:w16sdtdh="http://schemas.microsoft.com/office/word/2020/wordml/sdtdatahash" xmlns:w16se="http://schemas.microsoft.com/office/word/2015/wordml/symex" mc:Ignorable="w14 w15 w16se w16cid w16 w16cex w16sdtdh">
   <w:docDefaults>
     <w:rPrDefault>
       <w:rPr>
@@ -24525,7 +24553,7 @@
 </file>
 
 <file path=word/glossary/document.xml><?xml version="1.0" encoding="utf-8"?>
-<w:glossaryDocument xmlns:wpc="http://schemas.microsoft.com/office/word/2010/wordprocessingCanvas" xmlns:cx="http://schemas.microsoft.com/office/drawing/2014/chartex" xmlns:cx1="http://schemas.microsoft.com/office/drawing/2015/9/8/chartex" xmlns:cx2="http://schemas.microsoft.com/office/drawing/2015/10/21/chartex" xmlns:cx3="http://schemas.microsoft.com/office/drawing/2016/5/9/chartex" xmlns:cx4="http://schemas.microsoft.com/office/drawing/2016/5/10/chartex" xmlns:cx5="http://schemas.microsoft.com/office/drawing/2016/5/11/chartex" xmlns:cx6="http://schemas.microsoft.com/office/drawing/2016/5/12/chartex" xmlns:cx7="http://schemas.microsoft.com/office/drawing/2016/5/13/chartex" xmlns:cx8="http://schemas.microsoft.com/office/drawing/2016/5/14/chartex" xmlns:mc="http://schemas.openxmlformats.org/markup-compatibility/2006" xmlns:aink="http://schemas.microsoft.com/office/drawing/2016/ink" xmlns:am3d="http://schemas.microsoft.com/office/drawing/2017/model3d" xmlns:o="urn:schemas-microsoft-com:office:office" xmlns:oel="http://schemas.microsoft.com/office/2019/extlst" xmlns:r="http://schemas.openxmlformats.org/officeDocument/2006/relationships" xmlns:m="http://schemas.openxmlformats.org/officeDocument/2006/math" xmlns:v="urn:schemas-microsoft-com:vml" xmlns:wp14="http://schemas.microsoft.com/office/word/2010/wordprocessingDrawing" xmlns:wp="http://schemas.openxmlformats.org/drawingml/2006/wordprocessingDrawing" xmlns:w10="urn:schemas-microsoft-com:office:word" xmlns:w="http://schemas.openxmlformats.org/wordprocessingml/2006/main" xmlns:w14="http://schemas.microsoft.com/office/word/2010/wordml" xmlns:w15="http://schemas.microsoft.com/office/word/2012/wordml" xmlns:w16cex="http://schemas.microsoft.com/office/word/2018/wordml/cex" xmlns:w16cid="http://schemas.microsoft.com/office/word/2016/wordml/cid" xmlns:w16="http://schemas.microsoft.com/office/word/2018/wordml" xmlns:w16du="http://schemas.microsoft.com/office/word/2023/wordml/word16du" xmlns:w16sdtdh="http://schemas.microsoft.com/office/word/2020/wordml/sdtdatahash" xmlns:w16sdtfl="http://schemas.microsoft.com/office/word/2024/wordml/sdtformatlock" xmlns:w16se="http://schemas.microsoft.com/office/word/2015/wordml/symex" xmlns:wpg="http://schemas.microsoft.com/office/word/2010/wordprocessingGroup" xmlns:wpi="http://schemas.microsoft.com/office/word/2010/wordprocessingInk" xmlns:wne="http://schemas.microsoft.com/office/word/2006/wordml" xmlns:wps="http://schemas.microsoft.com/office/word/2010/wordprocessingShape" mc:Ignorable="w14 w15 w16se w16cid w16 w16cex w16sdtdh w16sdtfl w16du wp14">
+<w:glossaryDocument xmlns:wpc="http://schemas.microsoft.com/office/word/2010/wordprocessingCanvas" xmlns:cx="http://schemas.microsoft.com/office/drawing/2014/chartex" xmlns:cx1="http://schemas.microsoft.com/office/drawing/2015/9/8/chartex" xmlns:cx2="http://schemas.microsoft.com/office/drawing/2015/10/21/chartex" xmlns:cx3="http://schemas.microsoft.com/office/drawing/2016/5/9/chartex" xmlns:cx4="http://schemas.microsoft.com/office/drawing/2016/5/10/chartex" xmlns:cx5="http://schemas.microsoft.com/office/drawing/2016/5/11/chartex" xmlns:cx6="http://schemas.microsoft.com/office/drawing/2016/5/12/chartex" xmlns:cx7="http://schemas.microsoft.com/office/drawing/2016/5/13/chartex" xmlns:cx8="http://schemas.microsoft.com/office/drawing/2016/5/14/chartex" xmlns:mc="http://schemas.openxmlformats.org/markup-compatibility/2006" xmlns:aink="http://schemas.microsoft.com/office/drawing/2016/ink" xmlns:am3d="http://schemas.microsoft.com/office/drawing/2017/model3d" xmlns:o="urn:schemas-microsoft-com:office:office" xmlns:oel="http://schemas.microsoft.com/office/2019/extlst" xmlns:r="http://schemas.openxmlformats.org/officeDocument/2006/relationships" xmlns:m="http://schemas.openxmlformats.org/officeDocument/2006/math" xmlns:v="urn:schemas-microsoft-com:vml" xmlns:wp14="http://schemas.microsoft.com/office/word/2010/wordprocessingDrawing" xmlns:wp="http://schemas.openxmlformats.org/drawingml/2006/wordprocessingDrawing" xmlns:w10="urn:schemas-microsoft-com:office:word" xmlns:w="http://schemas.openxmlformats.org/wordprocessingml/2006/main" xmlns:w14="http://schemas.microsoft.com/office/word/2010/wordml" xmlns:w15="http://schemas.microsoft.com/office/word/2012/wordml" xmlns:w16cex="http://schemas.microsoft.com/office/word/2018/wordml/cex" xmlns:w16cid="http://schemas.microsoft.com/office/word/2016/wordml/cid" xmlns:w16="http://schemas.microsoft.com/office/word/2018/wordml" xmlns:w16sdtdh="http://schemas.microsoft.com/office/word/2020/wordml/sdtdatahash" xmlns:w16se="http://schemas.microsoft.com/office/word/2015/wordml/symex" xmlns:wpg="http://schemas.microsoft.com/office/word/2010/wordprocessingGroup" xmlns:wpi="http://schemas.microsoft.com/office/word/2010/wordprocessingInk" xmlns:wne="http://schemas.microsoft.com/office/word/2006/wordml" xmlns:wps="http://schemas.microsoft.com/office/word/2010/wordprocessingShape" mc:Ignorable="w14 w15 w16se w16cid w16 w16cex w16sdtdh wp14">
   <w:docParts>
     <w:docPart>
       <w:docPartPr>
@@ -24619,7 +24647,7 @@
 </file>
 
 <file path=word/glossary/fontTable.xml><?xml version="1.0" encoding="utf-8"?>
-<w:fonts xmlns:mc="http://schemas.openxmlformats.org/markup-compatibility/2006" xmlns:r="http://schemas.openxmlformats.org/officeDocument/2006/relationships" xmlns:w="http://schemas.openxmlformats.org/wordprocessingml/2006/main" xmlns:w14="http://schemas.microsoft.com/office/word/2010/wordml" xmlns:w15="http://schemas.microsoft.com/office/word/2012/wordml" xmlns:w16cex="http://schemas.microsoft.com/office/word/2018/wordml/cex" xmlns:w16cid="http://schemas.microsoft.com/office/word/2016/wordml/cid" xmlns:w16="http://schemas.microsoft.com/office/word/2018/wordml" xmlns:w16du="http://schemas.microsoft.com/office/word/2023/wordml/word16du" xmlns:w16sdtdh="http://schemas.microsoft.com/office/word/2020/wordml/sdtdatahash" xmlns:w16sdtfl="http://schemas.microsoft.com/office/word/2024/wordml/sdtformatlock" xmlns:w16se="http://schemas.microsoft.com/office/word/2015/wordml/symex" mc:Ignorable="w14 w15 w16se w16cid w16 w16cex w16sdtdh w16sdtfl w16du">
+<w:fonts xmlns:mc="http://schemas.openxmlformats.org/markup-compatibility/2006" xmlns:r="http://schemas.openxmlformats.org/officeDocument/2006/relationships" xmlns:w="http://schemas.openxmlformats.org/wordprocessingml/2006/main" xmlns:w14="http://schemas.microsoft.com/office/word/2010/wordml" xmlns:w15="http://schemas.microsoft.com/office/word/2012/wordml" xmlns:w16cex="http://schemas.microsoft.com/office/word/2018/wordml/cex" xmlns:w16cid="http://schemas.microsoft.com/office/word/2016/wordml/cid" xmlns:w16="http://schemas.microsoft.com/office/word/2018/wordml" xmlns:w16sdtdh="http://schemas.microsoft.com/office/word/2020/wordml/sdtdatahash" xmlns:w16se="http://schemas.microsoft.com/office/word/2015/wordml/symex" mc:Ignorable="w14 w15 w16se w16cid w16 w16cex w16sdtdh">
   <w:font w:name="Symbol">
     <w:panose1 w:val="05050102010706020507"/>
     <w:charset w:val="02"/>
@@ -24700,7 +24728,7 @@
 </file>
 
 <file path=word/glossary/settings.xml><?xml version="1.0" encoding="utf-8"?>
-<w:settings xmlns:mc="http://schemas.openxmlformats.org/markup-compatibility/2006" xmlns:o="urn:schemas-microsoft-com:office:office" xmlns:r="http://schemas.openxmlformats.org/officeDocument/2006/relationships" xmlns:m="http://schemas.openxmlformats.org/officeDocument/2006/math" xmlns:v="urn:schemas-microsoft-com:vml" xmlns:w10="urn:schemas-microsoft-com:office:word" xmlns:w="http://schemas.openxmlformats.org/wordprocessingml/2006/main" xmlns:w14="http://schemas.microsoft.com/office/word/2010/wordml" xmlns:w15="http://schemas.microsoft.com/office/word/2012/wordml" xmlns:w16cex="http://schemas.microsoft.com/office/word/2018/wordml/cex" xmlns:w16cid="http://schemas.microsoft.com/office/word/2016/wordml/cid" xmlns:w16="http://schemas.microsoft.com/office/word/2018/wordml" xmlns:w16du="http://schemas.microsoft.com/office/word/2023/wordml/word16du" xmlns:w16sdtdh="http://schemas.microsoft.com/office/word/2020/wordml/sdtdatahash" xmlns:w16sdtfl="http://schemas.microsoft.com/office/word/2024/wordml/sdtformatlock" xmlns:w16se="http://schemas.microsoft.com/office/word/2015/wordml/symex" xmlns:sl="http://schemas.openxmlformats.org/schemaLibrary/2006/main" mc:Ignorable="w14 w15 w16se w16cid w16 w16cex w16sdtdh w16sdtfl w16du">
+<w:settings xmlns:mc="http://schemas.openxmlformats.org/markup-compatibility/2006" xmlns:o="urn:schemas-microsoft-com:office:office" xmlns:r="http://schemas.openxmlformats.org/officeDocument/2006/relationships" xmlns:m="http://schemas.openxmlformats.org/officeDocument/2006/math" xmlns:v="urn:schemas-microsoft-com:vml" xmlns:w10="urn:schemas-microsoft-com:office:word" xmlns:w="http://schemas.openxmlformats.org/wordprocessingml/2006/main" xmlns:w14="http://schemas.microsoft.com/office/word/2010/wordml" xmlns:w15="http://schemas.microsoft.com/office/word/2012/wordml" xmlns:w16cex="http://schemas.microsoft.com/office/word/2018/wordml/cex" xmlns:w16cid="http://schemas.microsoft.com/office/word/2016/wordml/cid" xmlns:w16="http://schemas.microsoft.com/office/word/2018/wordml" xmlns:w16sdtdh="http://schemas.microsoft.com/office/word/2020/wordml/sdtdatahash" xmlns:w16se="http://schemas.microsoft.com/office/word/2015/wordml/symex" xmlns:sl="http://schemas.openxmlformats.org/schemaLibrary/2006/main" mc:Ignorable="w14 w15 w16se w16cid w16 w16cex w16sdtdh">
   <w:view w:val="normal"/>
   <w:defaultTabStop w:val="720"/>
   <w:characterSpacingControl w:val="doNotCompress"/>
@@ -24715,7 +24743,9 @@
   </w:compat>
   <w:rsids>
     <w:rsidRoot w:val="00F1188D"/>
+    <w:rsid w:val="00054B1C"/>
     <w:rsid w:val="000A1E7E"/>
+    <w:rsid w:val="000E6CB6"/>
     <w:rsid w:val="0015567D"/>
     <w:rsid w:val="00174C32"/>
     <w:rsid w:val="00195082"/>
@@ -24771,7 +24801,7 @@
 </file>
 
 <file path=word/glossary/styles.xml><?xml version="1.0" encoding="utf-8"?>
-<w:styles xmlns:mc="http://schemas.openxmlformats.org/markup-compatibility/2006" xmlns:r="http://schemas.openxmlformats.org/officeDocument/2006/relationships" xmlns:w="http://schemas.openxmlformats.org/wordprocessingml/2006/main" xmlns:w14="http://schemas.microsoft.com/office/word/2010/wordml" xmlns:w15="http://schemas.microsoft.com/office/word/2012/wordml" xmlns:w16cex="http://schemas.microsoft.com/office/word/2018/wordml/cex" xmlns:w16cid="http://schemas.microsoft.com/office/word/2016/wordml/cid" xmlns:w16="http://schemas.microsoft.com/office/word/2018/wordml" xmlns:w16du="http://schemas.microsoft.com/office/word/2023/wordml/word16du" xmlns:w16sdtdh="http://schemas.microsoft.com/office/word/2020/wordml/sdtdatahash" xmlns:w16sdtfl="http://schemas.microsoft.com/office/word/2024/wordml/sdtformatlock" xmlns:w16se="http://schemas.microsoft.com/office/word/2015/wordml/symex" mc:Ignorable="w14 w15 w16se w16cid w16 w16cex w16sdtdh w16sdtfl w16du">
+<w:styles xmlns:mc="http://schemas.openxmlformats.org/markup-compatibility/2006" xmlns:r="http://schemas.openxmlformats.org/officeDocument/2006/relationships" xmlns:w="http://schemas.openxmlformats.org/wordprocessingml/2006/main" xmlns:w14="http://schemas.microsoft.com/office/word/2010/wordml" xmlns:w15="http://schemas.microsoft.com/office/word/2012/wordml" xmlns:w16cex="http://schemas.microsoft.com/office/word/2018/wordml/cex" xmlns:w16cid="http://schemas.microsoft.com/office/word/2016/wordml/cid" xmlns:w16="http://schemas.microsoft.com/office/word/2018/wordml" xmlns:w16sdtdh="http://schemas.microsoft.com/office/word/2020/wordml/sdtdatahash" xmlns:w16se="http://schemas.microsoft.com/office/word/2015/wordml/symex" mc:Ignorable="w14 w15 w16se w16cid w16 w16cex w16sdtdh">
   <w:docDefaults>
     <w:rPrDefault>
       <w:rPr>
@@ -25222,7 +25252,7 @@
 </file>
 
 <file path=word/glossary/webSettings.xml><?xml version="1.0" encoding="utf-8"?>
-<w:webSettings xmlns:mc="http://schemas.openxmlformats.org/markup-compatibility/2006" xmlns:r="http://schemas.openxmlformats.org/officeDocument/2006/relationships" xmlns:w="http://schemas.openxmlformats.org/wordprocessingml/2006/main" xmlns:w14="http://schemas.microsoft.com/office/word/2010/wordml" xmlns:w15="http://schemas.microsoft.com/office/word/2012/wordml" xmlns:w16cex="http://schemas.microsoft.com/office/word/2018/wordml/cex" xmlns:w16cid="http://schemas.microsoft.com/office/word/2016/wordml/cid" xmlns:w16="http://schemas.microsoft.com/office/word/2018/wordml" xmlns:w16du="http://schemas.microsoft.com/office/word/2023/wordml/word16du" xmlns:w16sdtdh="http://schemas.microsoft.com/office/word/2020/wordml/sdtdatahash" xmlns:w16sdtfl="http://schemas.microsoft.com/office/word/2024/wordml/sdtformatlock" xmlns:w16se="http://schemas.microsoft.com/office/word/2015/wordml/symex" mc:Ignorable="w14 w15 w16se w16cid w16 w16cex w16sdtdh w16sdtfl w16du">
+<w:webSettings xmlns:mc="http://schemas.openxmlformats.org/markup-compatibility/2006" xmlns:r="http://schemas.openxmlformats.org/officeDocument/2006/relationships" xmlns:w="http://schemas.openxmlformats.org/wordprocessingml/2006/main" xmlns:w14="http://schemas.microsoft.com/office/word/2010/wordml" xmlns:w15="http://schemas.microsoft.com/office/word/2012/wordml" xmlns:w16cex="http://schemas.microsoft.com/office/word/2018/wordml/cex" xmlns:w16cid="http://schemas.microsoft.com/office/word/2016/wordml/cid" xmlns:w16="http://schemas.microsoft.com/office/word/2018/wordml" xmlns:w16sdtdh="http://schemas.microsoft.com/office/word/2020/wordml/sdtdatahash" xmlns:w16se="http://schemas.microsoft.com/office/word/2015/wordml/symex" mc:Ignorable="w14 w15 w16se w16cid w16 w16cex w16sdtdh">
   <w:optimizeForBrowser/>
   <w:allowPNG/>
 </w:webSettings>

</xml_diff>

<commit_message>
Move all MobSF Telegram analysis files into Israel Ogunseye folder
</commit_message>
<xml_diff>
--- a/ReportsAndDocuments/F25_4440_G12_worklogs.docx
+++ b/ReportsAndDocuments/F25_4440_G12_worklogs.docx
@@ -1,6 +1,6 @@
 
 <file path=word/document.xml><?xml version="1.0" encoding="utf-8"?>
-<w:document xmlns:wpc="http://schemas.microsoft.com/office/word/2010/wordprocessingCanvas" xmlns:cx="http://schemas.microsoft.com/office/drawing/2014/chartex" xmlns:cx1="http://schemas.microsoft.com/office/drawing/2015/9/8/chartex" xmlns:cx2="http://schemas.microsoft.com/office/drawing/2015/10/21/chartex" xmlns:cx3="http://schemas.microsoft.com/office/drawing/2016/5/9/chartex" xmlns:cx4="http://schemas.microsoft.com/office/drawing/2016/5/10/chartex" xmlns:cx5="http://schemas.microsoft.com/office/drawing/2016/5/11/chartex" xmlns:cx6="http://schemas.microsoft.com/office/drawing/2016/5/12/chartex" xmlns:cx7="http://schemas.microsoft.com/office/drawing/2016/5/13/chartex" xmlns:cx8="http://schemas.microsoft.com/office/drawing/2016/5/14/chartex" xmlns:mc="http://schemas.openxmlformats.org/markup-compatibility/2006" xmlns:aink="http://schemas.microsoft.com/office/drawing/2016/ink" xmlns:am3d="http://schemas.microsoft.com/office/drawing/2017/model3d" xmlns:o="urn:schemas-microsoft-com:office:office" xmlns:oel="http://schemas.microsoft.com/office/2019/extlst" xmlns:r="http://schemas.openxmlformats.org/officeDocument/2006/relationships" xmlns:m="http://schemas.openxmlformats.org/officeDocument/2006/math" xmlns:v="urn:schemas-microsoft-com:vml" xmlns:wp14="http://schemas.microsoft.com/office/word/2010/wordprocessingDrawing" xmlns:wp="http://schemas.openxmlformats.org/drawingml/2006/wordprocessingDrawing" xmlns:w10="urn:schemas-microsoft-com:office:word" xmlns:w="http://schemas.openxmlformats.org/wordprocessingml/2006/main" xmlns:w14="http://schemas.microsoft.com/office/word/2010/wordml" xmlns:w15="http://schemas.microsoft.com/office/word/2012/wordml" xmlns:w16cex="http://schemas.microsoft.com/office/word/2018/wordml/cex" xmlns:w16cid="http://schemas.microsoft.com/office/word/2016/wordml/cid" xmlns:w16="http://schemas.microsoft.com/office/word/2018/wordml" xmlns:w16sdtdh="http://schemas.microsoft.com/office/word/2020/wordml/sdtdatahash" xmlns:w16se="http://schemas.microsoft.com/office/word/2015/wordml/symex" xmlns:wpg="http://schemas.microsoft.com/office/word/2010/wordprocessingGroup" xmlns:wpi="http://schemas.microsoft.com/office/word/2010/wordprocessingInk" xmlns:wne="http://schemas.microsoft.com/office/word/2006/wordml" xmlns:wps="http://schemas.microsoft.com/office/word/2010/wordprocessingShape" mc:Ignorable="w14 w15 w16se w16cid w16 w16cex w16sdtdh wp14">
+<w:document xmlns:wpc="http://schemas.microsoft.com/office/word/2010/wordprocessingCanvas" xmlns:cx="http://schemas.microsoft.com/office/drawing/2014/chartex" xmlns:cx1="http://schemas.microsoft.com/office/drawing/2015/9/8/chartex" xmlns:cx2="http://schemas.microsoft.com/office/drawing/2015/10/21/chartex" xmlns:cx3="http://schemas.microsoft.com/office/drawing/2016/5/9/chartex" xmlns:cx4="http://schemas.microsoft.com/office/drawing/2016/5/10/chartex" xmlns:cx5="http://schemas.microsoft.com/office/drawing/2016/5/11/chartex" xmlns:cx6="http://schemas.microsoft.com/office/drawing/2016/5/12/chartex" xmlns:cx7="http://schemas.microsoft.com/office/drawing/2016/5/13/chartex" xmlns:cx8="http://schemas.microsoft.com/office/drawing/2016/5/14/chartex" xmlns:mc="http://schemas.openxmlformats.org/markup-compatibility/2006" xmlns:aink="http://schemas.microsoft.com/office/drawing/2016/ink" xmlns:am3d="http://schemas.microsoft.com/office/drawing/2017/model3d" xmlns:o="urn:schemas-microsoft-com:office:office" xmlns:oel="http://schemas.microsoft.com/office/2019/extlst" xmlns:r="http://schemas.openxmlformats.org/officeDocument/2006/relationships" xmlns:m="http://schemas.openxmlformats.org/officeDocument/2006/math" xmlns:v="urn:schemas-microsoft-com:vml" xmlns:wp14="http://schemas.microsoft.com/office/word/2010/wordprocessingDrawing" xmlns:wp="http://schemas.openxmlformats.org/drawingml/2006/wordprocessingDrawing" xmlns:w10="urn:schemas-microsoft-com:office:word" xmlns:w="http://schemas.openxmlformats.org/wordprocessingml/2006/main" xmlns:w14="http://schemas.microsoft.com/office/word/2010/wordml" xmlns:w15="http://schemas.microsoft.com/office/word/2012/wordml" xmlns:w16cex="http://schemas.microsoft.com/office/word/2018/wordml/cex" xmlns:w16cid="http://schemas.microsoft.com/office/word/2016/wordml/cid" xmlns:w16="http://schemas.microsoft.com/office/word/2018/wordml" xmlns:w16du="http://schemas.microsoft.com/office/word/2023/wordml/word16du" xmlns:w16sdtdh="http://schemas.microsoft.com/office/word/2020/wordml/sdtdatahash" xmlns:w16sdtfl="http://schemas.microsoft.com/office/word/2024/wordml/sdtformatlock" xmlns:w16se="http://schemas.microsoft.com/office/word/2015/wordml/symex" xmlns:wpg="http://schemas.microsoft.com/office/word/2010/wordprocessingGroup" xmlns:wpi="http://schemas.microsoft.com/office/word/2010/wordprocessingInk" xmlns:wne="http://schemas.microsoft.com/office/word/2006/wordml" xmlns:wps="http://schemas.microsoft.com/office/word/2010/wordprocessingShape" mc:Ignorable="w14 w15 w16se w16cid w16 w16cex w16sdtdh w16sdtfl w16du wp14">
   <w:body>
     <w:sdt>
       <w:sdtPr>
@@ -122,7 +122,7 @@
               <w:noProof/>
             </w:rPr>
             <w:drawing>
-              <wp:inline distT="0" distB="0" distL="0" distR="0" wp14:anchorId="57354EC8" wp14:editId="38BA7FE6">
+              <wp:inline distT="0" distB="0" distL="0" distR="0" wp14:anchorId="57354EC8" wp14:editId="4FF68F93">
                 <wp:extent cx="828675" cy="828675"/>
                 <wp:effectExtent l="0" t="0" r="9525" b="9525"/>
                 <wp:docPr id="14" name="Picture 14"/>
@@ -218,6 +218,10 @@
         <w:p>
           <w:pPr>
             <w:ind w:left="720"/>
+            <w:rPr>
+              <w:b/>
+              <w:bCs/>
+            </w:rPr>
           </w:pPr>
           <w:r>
             <w:rPr>
@@ -258,6 +262,18 @@
               <w:bCs/>
             </w:rPr>
             <w:t>300389708</w:t>
+          </w:r>
+        </w:p>
+        <w:p>
+          <w:pPr>
+            <w:ind w:left="720"/>
+          </w:pPr>
+          <w:r>
+            <w:rPr>
+              <w:b/>
+              <w:bCs/>
+            </w:rPr>
+            <w:t>ISRAEL OGUNSEYE -300368938</w:t>
           </w:r>
         </w:p>
         <w:p>
@@ -1413,7 +1429,7 @@
 </file>
 
 <file path=word/endnotes.xml><?xml version="1.0" encoding="utf-8"?>
-<w:endnotes xmlns:wpc="http://schemas.microsoft.com/office/word/2010/wordprocessingCanvas" xmlns:cx="http://schemas.microsoft.com/office/drawing/2014/chartex" xmlns:cx1="http://schemas.microsoft.com/office/drawing/2015/9/8/chartex" xmlns:cx2="http://schemas.microsoft.com/office/drawing/2015/10/21/chartex" xmlns:cx3="http://schemas.microsoft.com/office/drawing/2016/5/9/chartex" xmlns:cx4="http://schemas.microsoft.com/office/drawing/2016/5/10/chartex" xmlns:cx5="http://schemas.microsoft.com/office/drawing/2016/5/11/chartex" xmlns:cx6="http://schemas.microsoft.com/office/drawing/2016/5/12/chartex" xmlns:cx7="http://schemas.microsoft.com/office/drawing/2016/5/13/chartex" xmlns:cx8="http://schemas.microsoft.com/office/drawing/2016/5/14/chartex" xmlns:mc="http://schemas.openxmlformats.org/markup-compatibility/2006" xmlns:aink="http://schemas.microsoft.com/office/drawing/2016/ink" xmlns:am3d="http://schemas.microsoft.com/office/drawing/2017/model3d" xmlns:o="urn:schemas-microsoft-com:office:office" xmlns:oel="http://schemas.microsoft.com/office/2019/extlst" xmlns:r="http://schemas.openxmlformats.org/officeDocument/2006/relationships" xmlns:m="http://schemas.openxmlformats.org/officeDocument/2006/math" xmlns:v="urn:schemas-microsoft-com:vml" xmlns:wp14="http://schemas.microsoft.com/office/word/2010/wordprocessingDrawing" xmlns:wp="http://schemas.openxmlformats.org/drawingml/2006/wordprocessingDrawing" xmlns:w10="urn:schemas-microsoft-com:office:word" xmlns:w="http://schemas.openxmlformats.org/wordprocessingml/2006/main" xmlns:w14="http://schemas.microsoft.com/office/word/2010/wordml" xmlns:w15="http://schemas.microsoft.com/office/word/2012/wordml" xmlns:w16cex="http://schemas.microsoft.com/office/word/2018/wordml/cex" xmlns:w16cid="http://schemas.microsoft.com/office/word/2016/wordml/cid" xmlns:w16="http://schemas.microsoft.com/office/word/2018/wordml" xmlns:w16sdtdh="http://schemas.microsoft.com/office/word/2020/wordml/sdtdatahash" xmlns:w16se="http://schemas.microsoft.com/office/word/2015/wordml/symex" xmlns:wpg="http://schemas.microsoft.com/office/word/2010/wordprocessingGroup" xmlns:wpi="http://schemas.microsoft.com/office/word/2010/wordprocessingInk" xmlns:wne="http://schemas.microsoft.com/office/word/2006/wordml" xmlns:wps="http://schemas.microsoft.com/office/word/2010/wordprocessingShape" mc:Ignorable="w14 w15 w16se w16cid w16 w16cex w16sdtdh wp14">
+<w:endnotes xmlns:wpc="http://schemas.microsoft.com/office/word/2010/wordprocessingCanvas" xmlns:cx="http://schemas.microsoft.com/office/drawing/2014/chartex" xmlns:cx1="http://schemas.microsoft.com/office/drawing/2015/9/8/chartex" xmlns:cx2="http://schemas.microsoft.com/office/drawing/2015/10/21/chartex" xmlns:cx3="http://schemas.microsoft.com/office/drawing/2016/5/9/chartex" xmlns:cx4="http://schemas.microsoft.com/office/drawing/2016/5/10/chartex" xmlns:cx5="http://schemas.microsoft.com/office/drawing/2016/5/11/chartex" xmlns:cx6="http://schemas.microsoft.com/office/drawing/2016/5/12/chartex" xmlns:cx7="http://schemas.microsoft.com/office/drawing/2016/5/13/chartex" xmlns:cx8="http://schemas.microsoft.com/office/drawing/2016/5/14/chartex" xmlns:mc="http://schemas.openxmlformats.org/markup-compatibility/2006" xmlns:aink="http://schemas.microsoft.com/office/drawing/2016/ink" xmlns:am3d="http://schemas.microsoft.com/office/drawing/2017/model3d" xmlns:o="urn:schemas-microsoft-com:office:office" xmlns:oel="http://schemas.microsoft.com/office/2019/extlst" xmlns:r="http://schemas.openxmlformats.org/officeDocument/2006/relationships" xmlns:m="http://schemas.openxmlformats.org/officeDocument/2006/math" xmlns:v="urn:schemas-microsoft-com:vml" xmlns:wp14="http://schemas.microsoft.com/office/word/2010/wordprocessingDrawing" xmlns:wp="http://schemas.openxmlformats.org/drawingml/2006/wordprocessingDrawing" xmlns:w10="urn:schemas-microsoft-com:office:word" xmlns:w="http://schemas.openxmlformats.org/wordprocessingml/2006/main" xmlns:w14="http://schemas.microsoft.com/office/word/2010/wordml" xmlns:w15="http://schemas.microsoft.com/office/word/2012/wordml" xmlns:w16cex="http://schemas.microsoft.com/office/word/2018/wordml/cex" xmlns:w16cid="http://schemas.microsoft.com/office/word/2016/wordml/cid" xmlns:w16="http://schemas.microsoft.com/office/word/2018/wordml" xmlns:w16du="http://schemas.microsoft.com/office/word/2023/wordml/word16du" xmlns:w16sdtdh="http://schemas.microsoft.com/office/word/2020/wordml/sdtdatahash" xmlns:w16sdtfl="http://schemas.microsoft.com/office/word/2024/wordml/sdtformatlock" xmlns:w16se="http://schemas.microsoft.com/office/word/2015/wordml/symex" xmlns:wpg="http://schemas.microsoft.com/office/word/2010/wordprocessingGroup" xmlns:wpi="http://schemas.microsoft.com/office/word/2010/wordprocessingInk" xmlns:wne="http://schemas.microsoft.com/office/word/2006/wordml" xmlns:wps="http://schemas.microsoft.com/office/word/2010/wordprocessingShape" mc:Ignorable="w14 w15 w16se w16cid w16 w16cex w16sdtdh w16sdtfl w16du wp14">
   <w:endnote w:type="separator" w:id="-1">
     <w:p>
       <w:pPr>
@@ -1438,7 +1454,7 @@
 </file>
 
 <file path=word/footer1.xml><?xml version="1.0" encoding="utf-8"?>
-<w:ftr xmlns:wpc="http://schemas.microsoft.com/office/word/2010/wordprocessingCanvas" xmlns:cx="http://schemas.microsoft.com/office/drawing/2014/chartex" xmlns:cx1="http://schemas.microsoft.com/office/drawing/2015/9/8/chartex" xmlns:cx2="http://schemas.microsoft.com/office/drawing/2015/10/21/chartex" xmlns:cx3="http://schemas.microsoft.com/office/drawing/2016/5/9/chartex" xmlns:cx4="http://schemas.microsoft.com/office/drawing/2016/5/10/chartex" xmlns:cx5="http://schemas.microsoft.com/office/drawing/2016/5/11/chartex" xmlns:cx6="http://schemas.microsoft.com/office/drawing/2016/5/12/chartex" xmlns:cx7="http://schemas.microsoft.com/office/drawing/2016/5/13/chartex" xmlns:cx8="http://schemas.microsoft.com/office/drawing/2016/5/14/chartex" xmlns:mc="http://schemas.openxmlformats.org/markup-compatibility/2006" xmlns:aink="http://schemas.microsoft.com/office/drawing/2016/ink" xmlns:am3d="http://schemas.microsoft.com/office/drawing/2017/model3d" xmlns:o="urn:schemas-microsoft-com:office:office" xmlns:oel="http://schemas.microsoft.com/office/2019/extlst" xmlns:r="http://schemas.openxmlformats.org/officeDocument/2006/relationships" xmlns:m="http://schemas.openxmlformats.org/officeDocument/2006/math" xmlns:v="urn:schemas-microsoft-com:vml" xmlns:wp14="http://schemas.microsoft.com/office/word/2010/wordprocessingDrawing" xmlns:wp="http://schemas.openxmlformats.org/drawingml/2006/wordprocessingDrawing" xmlns:w10="urn:schemas-microsoft-com:office:word" xmlns:w="http://schemas.openxmlformats.org/wordprocessingml/2006/main" xmlns:w14="http://schemas.microsoft.com/office/word/2010/wordml" xmlns:w15="http://schemas.microsoft.com/office/word/2012/wordml" xmlns:w16cex="http://schemas.microsoft.com/office/word/2018/wordml/cex" xmlns:w16cid="http://schemas.microsoft.com/office/word/2016/wordml/cid" xmlns:w16="http://schemas.microsoft.com/office/word/2018/wordml" xmlns:w16sdtdh="http://schemas.microsoft.com/office/word/2020/wordml/sdtdatahash" xmlns:w16se="http://schemas.microsoft.com/office/word/2015/wordml/symex" xmlns:wpg="http://schemas.microsoft.com/office/word/2010/wordprocessingGroup" xmlns:wpi="http://schemas.microsoft.com/office/word/2010/wordprocessingInk" xmlns:wne="http://schemas.microsoft.com/office/word/2006/wordml" xmlns:wps="http://schemas.microsoft.com/office/word/2010/wordprocessingShape" mc:Ignorable="w14 w15 w16se w16cid w16 w16cex w16sdtdh wp14">
+<w:ftr xmlns:wpc="http://schemas.microsoft.com/office/word/2010/wordprocessingCanvas" xmlns:cx="http://schemas.microsoft.com/office/drawing/2014/chartex" xmlns:cx1="http://schemas.microsoft.com/office/drawing/2015/9/8/chartex" xmlns:cx2="http://schemas.microsoft.com/office/drawing/2015/10/21/chartex" xmlns:cx3="http://schemas.microsoft.com/office/drawing/2016/5/9/chartex" xmlns:cx4="http://schemas.microsoft.com/office/drawing/2016/5/10/chartex" xmlns:cx5="http://schemas.microsoft.com/office/drawing/2016/5/11/chartex" xmlns:cx6="http://schemas.microsoft.com/office/drawing/2016/5/12/chartex" xmlns:cx7="http://schemas.microsoft.com/office/drawing/2016/5/13/chartex" xmlns:cx8="http://schemas.microsoft.com/office/drawing/2016/5/14/chartex" xmlns:mc="http://schemas.openxmlformats.org/markup-compatibility/2006" xmlns:aink="http://schemas.microsoft.com/office/drawing/2016/ink" xmlns:am3d="http://schemas.microsoft.com/office/drawing/2017/model3d" xmlns:o="urn:schemas-microsoft-com:office:office" xmlns:oel="http://schemas.microsoft.com/office/2019/extlst" xmlns:r="http://schemas.openxmlformats.org/officeDocument/2006/relationships" xmlns:m="http://schemas.openxmlformats.org/officeDocument/2006/math" xmlns:v="urn:schemas-microsoft-com:vml" xmlns:wp14="http://schemas.microsoft.com/office/word/2010/wordprocessingDrawing" xmlns:wp="http://schemas.openxmlformats.org/drawingml/2006/wordprocessingDrawing" xmlns:w10="urn:schemas-microsoft-com:office:word" xmlns:w="http://schemas.openxmlformats.org/wordprocessingml/2006/main" xmlns:w14="http://schemas.microsoft.com/office/word/2010/wordml" xmlns:w15="http://schemas.microsoft.com/office/word/2012/wordml" xmlns:w16cex="http://schemas.microsoft.com/office/word/2018/wordml/cex" xmlns:w16cid="http://schemas.microsoft.com/office/word/2016/wordml/cid" xmlns:w16="http://schemas.microsoft.com/office/word/2018/wordml" xmlns:w16du="http://schemas.microsoft.com/office/word/2023/wordml/word16du" xmlns:w16sdtdh="http://schemas.microsoft.com/office/word/2020/wordml/sdtdatahash" xmlns:w16sdtfl="http://schemas.microsoft.com/office/word/2024/wordml/sdtformatlock" xmlns:w16se="http://schemas.microsoft.com/office/word/2015/wordml/symex" xmlns:wpg="http://schemas.microsoft.com/office/word/2010/wordprocessingGroup" xmlns:wpi="http://schemas.microsoft.com/office/word/2010/wordprocessingInk" xmlns:wne="http://schemas.microsoft.com/office/word/2006/wordml" xmlns:wps="http://schemas.microsoft.com/office/word/2010/wordprocessingShape" mc:Ignorable="w14 w15 w16se w16cid w16 w16cex w16sdtdh w16sdtfl w16du wp14">
   <w:p>
     <w:pPr>
       <w:pStyle w:val="Footer"/>
@@ -1524,7 +1540,7 @@
 </file>
 
 <file path=word/footnotes.xml><?xml version="1.0" encoding="utf-8"?>
-<w:footnotes xmlns:wpc="http://schemas.microsoft.com/office/word/2010/wordprocessingCanvas" xmlns:cx="http://schemas.microsoft.com/office/drawing/2014/chartex" xmlns:cx1="http://schemas.microsoft.com/office/drawing/2015/9/8/chartex" xmlns:cx2="http://schemas.microsoft.com/office/drawing/2015/10/21/chartex" xmlns:cx3="http://schemas.microsoft.com/office/drawing/2016/5/9/chartex" xmlns:cx4="http://schemas.microsoft.com/office/drawing/2016/5/10/chartex" xmlns:cx5="http://schemas.microsoft.com/office/drawing/2016/5/11/chartex" xmlns:cx6="http://schemas.microsoft.com/office/drawing/2016/5/12/chartex" xmlns:cx7="http://schemas.microsoft.com/office/drawing/2016/5/13/chartex" xmlns:cx8="http://schemas.microsoft.com/office/drawing/2016/5/14/chartex" xmlns:mc="http://schemas.openxmlformats.org/markup-compatibility/2006" xmlns:aink="http://schemas.microsoft.com/office/drawing/2016/ink" xmlns:am3d="http://schemas.microsoft.com/office/drawing/2017/model3d" xmlns:o="urn:schemas-microsoft-com:office:office" xmlns:oel="http://schemas.microsoft.com/office/2019/extlst" xmlns:r="http://schemas.openxmlformats.org/officeDocument/2006/relationships" xmlns:m="http://schemas.openxmlformats.org/officeDocument/2006/math" xmlns:v="urn:schemas-microsoft-com:vml" xmlns:wp14="http://schemas.microsoft.com/office/word/2010/wordprocessingDrawing" xmlns:wp="http://schemas.openxmlformats.org/drawingml/2006/wordprocessingDrawing" xmlns:w10="urn:schemas-microsoft-com:office:word" xmlns:w="http://schemas.openxmlformats.org/wordprocessingml/2006/main" xmlns:w14="http://schemas.microsoft.com/office/word/2010/wordml" xmlns:w15="http://schemas.microsoft.com/office/word/2012/wordml" xmlns:w16cex="http://schemas.microsoft.com/office/word/2018/wordml/cex" xmlns:w16cid="http://schemas.microsoft.com/office/word/2016/wordml/cid" xmlns:w16="http://schemas.microsoft.com/office/word/2018/wordml" xmlns:w16sdtdh="http://schemas.microsoft.com/office/word/2020/wordml/sdtdatahash" xmlns:w16se="http://schemas.microsoft.com/office/word/2015/wordml/symex" xmlns:wpg="http://schemas.microsoft.com/office/word/2010/wordprocessingGroup" xmlns:wpi="http://schemas.microsoft.com/office/word/2010/wordprocessingInk" xmlns:wne="http://schemas.microsoft.com/office/word/2006/wordml" xmlns:wps="http://schemas.microsoft.com/office/word/2010/wordprocessingShape" mc:Ignorable="w14 w15 w16se w16cid w16 w16cex w16sdtdh wp14">
+<w:footnotes xmlns:wpc="http://schemas.microsoft.com/office/word/2010/wordprocessingCanvas" xmlns:cx="http://schemas.microsoft.com/office/drawing/2014/chartex" xmlns:cx1="http://schemas.microsoft.com/office/drawing/2015/9/8/chartex" xmlns:cx2="http://schemas.microsoft.com/office/drawing/2015/10/21/chartex" xmlns:cx3="http://schemas.microsoft.com/office/drawing/2016/5/9/chartex" xmlns:cx4="http://schemas.microsoft.com/office/drawing/2016/5/10/chartex" xmlns:cx5="http://schemas.microsoft.com/office/drawing/2016/5/11/chartex" xmlns:cx6="http://schemas.microsoft.com/office/drawing/2016/5/12/chartex" xmlns:cx7="http://schemas.microsoft.com/office/drawing/2016/5/13/chartex" xmlns:cx8="http://schemas.microsoft.com/office/drawing/2016/5/14/chartex" xmlns:mc="http://schemas.openxmlformats.org/markup-compatibility/2006" xmlns:aink="http://schemas.microsoft.com/office/drawing/2016/ink" xmlns:am3d="http://schemas.microsoft.com/office/drawing/2017/model3d" xmlns:o="urn:schemas-microsoft-com:office:office" xmlns:oel="http://schemas.microsoft.com/office/2019/extlst" xmlns:r="http://schemas.openxmlformats.org/officeDocument/2006/relationships" xmlns:m="http://schemas.openxmlformats.org/officeDocument/2006/math" xmlns:v="urn:schemas-microsoft-com:vml" xmlns:wp14="http://schemas.microsoft.com/office/word/2010/wordprocessingDrawing" xmlns:wp="http://schemas.openxmlformats.org/drawingml/2006/wordprocessingDrawing" xmlns:w10="urn:schemas-microsoft-com:office:word" xmlns:w="http://schemas.openxmlformats.org/wordprocessingml/2006/main" xmlns:w14="http://schemas.microsoft.com/office/word/2010/wordml" xmlns:w15="http://schemas.microsoft.com/office/word/2012/wordml" xmlns:w16cex="http://schemas.microsoft.com/office/word/2018/wordml/cex" xmlns:w16cid="http://schemas.microsoft.com/office/word/2016/wordml/cid" xmlns:w16="http://schemas.microsoft.com/office/word/2018/wordml" xmlns:w16du="http://schemas.microsoft.com/office/word/2023/wordml/word16du" xmlns:w16sdtdh="http://schemas.microsoft.com/office/word/2020/wordml/sdtdatahash" xmlns:w16sdtfl="http://schemas.microsoft.com/office/word/2024/wordml/sdtformatlock" xmlns:w16se="http://schemas.microsoft.com/office/word/2015/wordml/symex" xmlns:wpg="http://schemas.microsoft.com/office/word/2010/wordprocessingGroup" xmlns:wpi="http://schemas.microsoft.com/office/word/2010/wordprocessingInk" xmlns:wne="http://schemas.microsoft.com/office/word/2006/wordml" xmlns:wps="http://schemas.microsoft.com/office/word/2010/wordprocessingShape" mc:Ignorable="w14 w15 w16se w16cid w16 w16cex w16sdtdh w16sdtfl w16du wp14">
   <w:footnote w:type="separator" w:id="-1">
     <w:p>
       <w:pPr>
@@ -1549,7 +1565,7 @@
 </file>
 
 <file path=word/numbering.xml><?xml version="1.0" encoding="utf-8"?>
-<w:numbering xmlns:wpc="http://schemas.microsoft.com/office/word/2010/wordprocessingCanvas" xmlns:cx="http://schemas.microsoft.com/office/drawing/2014/chartex" xmlns:cx1="http://schemas.microsoft.com/office/drawing/2015/9/8/chartex" xmlns:cx2="http://schemas.microsoft.com/office/drawing/2015/10/21/chartex" xmlns:cx3="http://schemas.microsoft.com/office/drawing/2016/5/9/chartex" xmlns:cx4="http://schemas.microsoft.com/office/drawing/2016/5/10/chartex" xmlns:cx5="http://schemas.microsoft.com/office/drawing/2016/5/11/chartex" xmlns:cx6="http://schemas.microsoft.com/office/drawing/2016/5/12/chartex" xmlns:cx7="http://schemas.microsoft.com/office/drawing/2016/5/13/chartex" xmlns:cx8="http://schemas.microsoft.com/office/drawing/2016/5/14/chartex" xmlns:mc="http://schemas.openxmlformats.org/markup-compatibility/2006" xmlns:aink="http://schemas.microsoft.com/office/drawing/2016/ink" xmlns:am3d="http://schemas.microsoft.com/office/drawing/2017/model3d" xmlns:o="urn:schemas-microsoft-com:office:office" xmlns:oel="http://schemas.microsoft.com/office/2019/extlst" xmlns:r="http://schemas.openxmlformats.org/officeDocument/2006/relationships" xmlns:m="http://schemas.openxmlformats.org/officeDocument/2006/math" xmlns:v="urn:schemas-microsoft-com:vml" xmlns:wp14="http://schemas.microsoft.com/office/word/2010/wordprocessingDrawing" xmlns:wp="http://schemas.openxmlformats.org/drawingml/2006/wordprocessingDrawing" xmlns:w10="urn:schemas-microsoft-com:office:word" xmlns:w="http://schemas.openxmlformats.org/wordprocessingml/2006/main" xmlns:w14="http://schemas.microsoft.com/office/word/2010/wordml" xmlns:w15="http://schemas.microsoft.com/office/word/2012/wordml" xmlns:w16cex="http://schemas.microsoft.com/office/word/2018/wordml/cex" xmlns:w16cid="http://schemas.microsoft.com/office/word/2016/wordml/cid" xmlns:w16="http://schemas.microsoft.com/office/word/2018/wordml" xmlns:w16sdtdh="http://schemas.microsoft.com/office/word/2020/wordml/sdtdatahash" xmlns:w16se="http://schemas.microsoft.com/office/word/2015/wordml/symex" xmlns:wpg="http://schemas.microsoft.com/office/word/2010/wordprocessingGroup" xmlns:wpi="http://schemas.microsoft.com/office/word/2010/wordprocessingInk" xmlns:wne="http://schemas.microsoft.com/office/word/2006/wordml" xmlns:wps="http://schemas.microsoft.com/office/word/2010/wordprocessingShape" mc:Ignorable="w14 w15 w16se w16cid w16 w16cex w16sdtdh wp14">
+<w:numbering xmlns:wpc="http://schemas.microsoft.com/office/word/2010/wordprocessingCanvas" xmlns:cx="http://schemas.microsoft.com/office/drawing/2014/chartex" xmlns:cx1="http://schemas.microsoft.com/office/drawing/2015/9/8/chartex" xmlns:cx2="http://schemas.microsoft.com/office/drawing/2015/10/21/chartex" xmlns:cx3="http://schemas.microsoft.com/office/drawing/2016/5/9/chartex" xmlns:cx4="http://schemas.microsoft.com/office/drawing/2016/5/10/chartex" xmlns:cx5="http://schemas.microsoft.com/office/drawing/2016/5/11/chartex" xmlns:cx6="http://schemas.microsoft.com/office/drawing/2016/5/12/chartex" xmlns:cx7="http://schemas.microsoft.com/office/drawing/2016/5/13/chartex" xmlns:cx8="http://schemas.microsoft.com/office/drawing/2016/5/14/chartex" xmlns:mc="http://schemas.openxmlformats.org/markup-compatibility/2006" xmlns:aink="http://schemas.microsoft.com/office/drawing/2016/ink" xmlns:am3d="http://schemas.microsoft.com/office/drawing/2017/model3d" xmlns:o="urn:schemas-microsoft-com:office:office" xmlns:oel="http://schemas.microsoft.com/office/2019/extlst" xmlns:r="http://schemas.openxmlformats.org/officeDocument/2006/relationships" xmlns:m="http://schemas.openxmlformats.org/officeDocument/2006/math" xmlns:v="urn:schemas-microsoft-com:vml" xmlns:wp14="http://schemas.microsoft.com/office/word/2010/wordprocessingDrawing" xmlns:wp="http://schemas.openxmlformats.org/drawingml/2006/wordprocessingDrawing" xmlns:w10="urn:schemas-microsoft-com:office:word" xmlns:w="http://schemas.openxmlformats.org/wordprocessingml/2006/main" xmlns:w14="http://schemas.microsoft.com/office/word/2010/wordml" xmlns:w15="http://schemas.microsoft.com/office/word/2012/wordml" xmlns:w16cex="http://schemas.microsoft.com/office/word/2018/wordml/cex" xmlns:w16cid="http://schemas.microsoft.com/office/word/2016/wordml/cid" xmlns:w16="http://schemas.microsoft.com/office/word/2018/wordml" xmlns:w16du="http://schemas.microsoft.com/office/word/2023/wordml/word16du" xmlns:w16sdtdh="http://schemas.microsoft.com/office/word/2020/wordml/sdtdatahash" xmlns:w16sdtfl="http://schemas.microsoft.com/office/word/2024/wordml/sdtformatlock" xmlns:w16se="http://schemas.microsoft.com/office/word/2015/wordml/symex" xmlns:wpg="http://schemas.microsoft.com/office/word/2010/wordprocessingGroup" xmlns:wpi="http://schemas.microsoft.com/office/word/2010/wordprocessingInk" xmlns:wne="http://schemas.microsoft.com/office/word/2006/wordml" xmlns:wps="http://schemas.microsoft.com/office/word/2010/wordprocessingShape" mc:Ignorable="w14 w15 w16se w16cid w16 w16cex w16sdtdh w16sdtfl w16du wp14">
   <w:abstractNum w:abstractNumId="0" w15:restartNumberingAfterBreak="0">
     <w:nsid w:val="017E6444"/>
     <w:multiLevelType w:val="multilevel"/>
@@ -23342,7 +23358,7 @@
 </file>
 
 <file path=word/styles.xml><?xml version="1.0" encoding="utf-8"?>
-<w:styles xmlns:mc="http://schemas.openxmlformats.org/markup-compatibility/2006" xmlns:r="http://schemas.openxmlformats.org/officeDocument/2006/relationships" xmlns:w="http://schemas.openxmlformats.org/wordprocessingml/2006/main" xmlns:w14="http://schemas.microsoft.com/office/word/2010/wordml" xmlns:w15="http://schemas.microsoft.com/office/word/2012/wordml" xmlns:w16cex="http://schemas.microsoft.com/office/word/2018/wordml/cex" xmlns:w16cid="http://schemas.microsoft.com/office/word/2016/wordml/cid" xmlns:w16="http://schemas.microsoft.com/office/word/2018/wordml" xmlns:w16sdtdh="http://schemas.microsoft.com/office/word/2020/wordml/sdtdatahash" xmlns:w16se="http://schemas.microsoft.com/office/word/2015/wordml/symex" mc:Ignorable="w14 w15 w16se w16cid w16 w16cex w16sdtdh">
+<w:styles xmlns:mc="http://schemas.openxmlformats.org/markup-compatibility/2006" xmlns:r="http://schemas.openxmlformats.org/officeDocument/2006/relationships" xmlns:w="http://schemas.openxmlformats.org/wordprocessingml/2006/main" xmlns:w14="http://schemas.microsoft.com/office/word/2010/wordml" xmlns:w15="http://schemas.microsoft.com/office/word/2012/wordml" xmlns:w16cex="http://schemas.microsoft.com/office/word/2018/wordml/cex" xmlns:w16cid="http://schemas.microsoft.com/office/word/2016/wordml/cid" xmlns:w16="http://schemas.microsoft.com/office/word/2018/wordml" xmlns:w16du="http://schemas.microsoft.com/office/word/2023/wordml/word16du" xmlns:w16sdtdh="http://schemas.microsoft.com/office/word/2020/wordml/sdtdatahash" xmlns:w16sdtfl="http://schemas.microsoft.com/office/word/2024/wordml/sdtformatlock" xmlns:w16se="http://schemas.microsoft.com/office/word/2015/wordml/symex" mc:Ignorable="w14 w15 w16se w16cid w16 w16cex w16sdtdh w16sdtfl w16du">
   <w:docDefaults>
     <w:rPrDefault>
       <w:rPr>
@@ -24553,7 +24569,7 @@
 </file>
 
 <file path=word/glossary/document.xml><?xml version="1.0" encoding="utf-8"?>
-<w:glossaryDocument xmlns:wpc="http://schemas.microsoft.com/office/word/2010/wordprocessingCanvas" xmlns:cx="http://schemas.microsoft.com/office/drawing/2014/chartex" xmlns:cx1="http://schemas.microsoft.com/office/drawing/2015/9/8/chartex" xmlns:cx2="http://schemas.microsoft.com/office/drawing/2015/10/21/chartex" xmlns:cx3="http://schemas.microsoft.com/office/drawing/2016/5/9/chartex" xmlns:cx4="http://schemas.microsoft.com/office/drawing/2016/5/10/chartex" xmlns:cx5="http://schemas.microsoft.com/office/drawing/2016/5/11/chartex" xmlns:cx6="http://schemas.microsoft.com/office/drawing/2016/5/12/chartex" xmlns:cx7="http://schemas.microsoft.com/office/drawing/2016/5/13/chartex" xmlns:cx8="http://schemas.microsoft.com/office/drawing/2016/5/14/chartex" xmlns:mc="http://schemas.openxmlformats.org/markup-compatibility/2006" xmlns:aink="http://schemas.microsoft.com/office/drawing/2016/ink" xmlns:am3d="http://schemas.microsoft.com/office/drawing/2017/model3d" xmlns:o="urn:schemas-microsoft-com:office:office" xmlns:oel="http://schemas.microsoft.com/office/2019/extlst" xmlns:r="http://schemas.openxmlformats.org/officeDocument/2006/relationships" xmlns:m="http://schemas.openxmlformats.org/officeDocument/2006/math" xmlns:v="urn:schemas-microsoft-com:vml" xmlns:wp14="http://schemas.microsoft.com/office/word/2010/wordprocessingDrawing" xmlns:wp="http://schemas.openxmlformats.org/drawingml/2006/wordprocessingDrawing" xmlns:w10="urn:schemas-microsoft-com:office:word" xmlns:w="http://schemas.openxmlformats.org/wordprocessingml/2006/main" xmlns:w14="http://schemas.microsoft.com/office/word/2010/wordml" xmlns:w15="http://schemas.microsoft.com/office/word/2012/wordml" xmlns:w16cex="http://schemas.microsoft.com/office/word/2018/wordml/cex" xmlns:w16cid="http://schemas.microsoft.com/office/word/2016/wordml/cid" xmlns:w16="http://schemas.microsoft.com/office/word/2018/wordml" xmlns:w16sdtdh="http://schemas.microsoft.com/office/word/2020/wordml/sdtdatahash" xmlns:w16se="http://schemas.microsoft.com/office/word/2015/wordml/symex" xmlns:wpg="http://schemas.microsoft.com/office/word/2010/wordprocessingGroup" xmlns:wpi="http://schemas.microsoft.com/office/word/2010/wordprocessingInk" xmlns:wne="http://schemas.microsoft.com/office/word/2006/wordml" xmlns:wps="http://schemas.microsoft.com/office/word/2010/wordprocessingShape" mc:Ignorable="w14 w15 w16se w16cid w16 w16cex w16sdtdh wp14">
+<w:glossaryDocument xmlns:wpc="http://schemas.microsoft.com/office/word/2010/wordprocessingCanvas" xmlns:cx="http://schemas.microsoft.com/office/drawing/2014/chartex" xmlns:cx1="http://schemas.microsoft.com/office/drawing/2015/9/8/chartex" xmlns:cx2="http://schemas.microsoft.com/office/drawing/2015/10/21/chartex" xmlns:cx3="http://schemas.microsoft.com/office/drawing/2016/5/9/chartex" xmlns:cx4="http://schemas.microsoft.com/office/drawing/2016/5/10/chartex" xmlns:cx5="http://schemas.microsoft.com/office/drawing/2016/5/11/chartex" xmlns:cx6="http://schemas.microsoft.com/office/drawing/2016/5/12/chartex" xmlns:cx7="http://schemas.microsoft.com/office/drawing/2016/5/13/chartex" xmlns:cx8="http://schemas.microsoft.com/office/drawing/2016/5/14/chartex" xmlns:mc="http://schemas.openxmlformats.org/markup-compatibility/2006" xmlns:aink="http://schemas.microsoft.com/office/drawing/2016/ink" xmlns:am3d="http://schemas.microsoft.com/office/drawing/2017/model3d" xmlns:o="urn:schemas-microsoft-com:office:office" xmlns:oel="http://schemas.microsoft.com/office/2019/extlst" xmlns:r="http://schemas.openxmlformats.org/officeDocument/2006/relationships" xmlns:m="http://schemas.openxmlformats.org/officeDocument/2006/math" xmlns:v="urn:schemas-microsoft-com:vml" xmlns:wp14="http://schemas.microsoft.com/office/word/2010/wordprocessingDrawing" xmlns:wp="http://schemas.openxmlformats.org/drawingml/2006/wordprocessingDrawing" xmlns:w10="urn:schemas-microsoft-com:office:word" xmlns:w="http://schemas.openxmlformats.org/wordprocessingml/2006/main" xmlns:w14="http://schemas.microsoft.com/office/word/2010/wordml" xmlns:w15="http://schemas.microsoft.com/office/word/2012/wordml" xmlns:w16cex="http://schemas.microsoft.com/office/word/2018/wordml/cex" xmlns:w16cid="http://schemas.microsoft.com/office/word/2016/wordml/cid" xmlns:w16="http://schemas.microsoft.com/office/word/2018/wordml" xmlns:w16du="http://schemas.microsoft.com/office/word/2023/wordml/word16du" xmlns:w16sdtdh="http://schemas.microsoft.com/office/word/2020/wordml/sdtdatahash" xmlns:w16sdtfl="http://schemas.microsoft.com/office/word/2024/wordml/sdtformatlock" xmlns:w16se="http://schemas.microsoft.com/office/word/2015/wordml/symex" xmlns:wpg="http://schemas.microsoft.com/office/word/2010/wordprocessingGroup" xmlns:wpi="http://schemas.microsoft.com/office/word/2010/wordprocessingInk" xmlns:wne="http://schemas.microsoft.com/office/word/2006/wordml" xmlns:wps="http://schemas.microsoft.com/office/word/2010/wordprocessingShape" mc:Ignorable="w14 w15 w16se w16cid w16 w16cex w16sdtdh w16sdtfl w16du wp14">
   <w:docParts>
     <w:docPart>
       <w:docPartPr>
@@ -24647,7 +24663,7 @@
 </file>
 
 <file path=word/glossary/fontTable.xml><?xml version="1.0" encoding="utf-8"?>
-<w:fonts xmlns:mc="http://schemas.openxmlformats.org/markup-compatibility/2006" xmlns:r="http://schemas.openxmlformats.org/officeDocument/2006/relationships" xmlns:w="http://schemas.openxmlformats.org/wordprocessingml/2006/main" xmlns:w14="http://schemas.microsoft.com/office/word/2010/wordml" xmlns:w15="http://schemas.microsoft.com/office/word/2012/wordml" xmlns:w16cex="http://schemas.microsoft.com/office/word/2018/wordml/cex" xmlns:w16cid="http://schemas.microsoft.com/office/word/2016/wordml/cid" xmlns:w16="http://schemas.microsoft.com/office/word/2018/wordml" xmlns:w16sdtdh="http://schemas.microsoft.com/office/word/2020/wordml/sdtdatahash" xmlns:w16se="http://schemas.microsoft.com/office/word/2015/wordml/symex" mc:Ignorable="w14 w15 w16se w16cid w16 w16cex w16sdtdh">
+<w:fonts xmlns:mc="http://schemas.openxmlformats.org/markup-compatibility/2006" xmlns:r="http://schemas.openxmlformats.org/officeDocument/2006/relationships" xmlns:w="http://schemas.openxmlformats.org/wordprocessingml/2006/main" xmlns:w14="http://schemas.microsoft.com/office/word/2010/wordml" xmlns:w15="http://schemas.microsoft.com/office/word/2012/wordml" xmlns:w16cex="http://schemas.microsoft.com/office/word/2018/wordml/cex" xmlns:w16cid="http://schemas.microsoft.com/office/word/2016/wordml/cid" xmlns:w16="http://schemas.microsoft.com/office/word/2018/wordml" xmlns:w16du="http://schemas.microsoft.com/office/word/2023/wordml/word16du" xmlns:w16sdtdh="http://schemas.microsoft.com/office/word/2020/wordml/sdtdatahash" xmlns:w16sdtfl="http://schemas.microsoft.com/office/word/2024/wordml/sdtformatlock" xmlns:w16se="http://schemas.microsoft.com/office/word/2015/wordml/symex" mc:Ignorable="w14 w15 w16se w16cid w16 w16cex w16sdtdh w16sdtfl w16du">
   <w:font w:name="Symbol">
     <w:panose1 w:val="05050102010706020507"/>
     <w:charset w:val="02"/>
@@ -24728,7 +24744,7 @@
 </file>
 
 <file path=word/glossary/settings.xml><?xml version="1.0" encoding="utf-8"?>
-<w:settings xmlns:mc="http://schemas.openxmlformats.org/markup-compatibility/2006" xmlns:o="urn:schemas-microsoft-com:office:office" xmlns:r="http://schemas.openxmlformats.org/officeDocument/2006/relationships" xmlns:m="http://schemas.openxmlformats.org/officeDocument/2006/math" xmlns:v="urn:schemas-microsoft-com:vml" xmlns:w10="urn:schemas-microsoft-com:office:word" xmlns:w="http://schemas.openxmlformats.org/wordprocessingml/2006/main" xmlns:w14="http://schemas.microsoft.com/office/word/2010/wordml" xmlns:w15="http://schemas.microsoft.com/office/word/2012/wordml" xmlns:w16cex="http://schemas.microsoft.com/office/word/2018/wordml/cex" xmlns:w16cid="http://schemas.microsoft.com/office/word/2016/wordml/cid" xmlns:w16="http://schemas.microsoft.com/office/word/2018/wordml" xmlns:w16sdtdh="http://schemas.microsoft.com/office/word/2020/wordml/sdtdatahash" xmlns:w16se="http://schemas.microsoft.com/office/word/2015/wordml/symex" xmlns:sl="http://schemas.openxmlformats.org/schemaLibrary/2006/main" mc:Ignorable="w14 w15 w16se w16cid w16 w16cex w16sdtdh">
+<w:settings xmlns:mc="http://schemas.openxmlformats.org/markup-compatibility/2006" xmlns:o="urn:schemas-microsoft-com:office:office" xmlns:r="http://schemas.openxmlformats.org/officeDocument/2006/relationships" xmlns:m="http://schemas.openxmlformats.org/officeDocument/2006/math" xmlns:v="urn:schemas-microsoft-com:vml" xmlns:w10="urn:schemas-microsoft-com:office:word" xmlns:w="http://schemas.openxmlformats.org/wordprocessingml/2006/main" xmlns:w14="http://schemas.microsoft.com/office/word/2010/wordml" xmlns:w15="http://schemas.microsoft.com/office/word/2012/wordml" xmlns:w16cex="http://schemas.microsoft.com/office/word/2018/wordml/cex" xmlns:w16cid="http://schemas.microsoft.com/office/word/2016/wordml/cid" xmlns:w16="http://schemas.microsoft.com/office/word/2018/wordml" xmlns:w16du="http://schemas.microsoft.com/office/word/2023/wordml/word16du" xmlns:w16sdtdh="http://schemas.microsoft.com/office/word/2020/wordml/sdtdatahash" xmlns:w16sdtfl="http://schemas.microsoft.com/office/word/2024/wordml/sdtformatlock" xmlns:w16se="http://schemas.microsoft.com/office/word/2015/wordml/symex" xmlns:sl="http://schemas.openxmlformats.org/schemaLibrary/2006/main" mc:Ignorable="w14 w15 w16se w16cid w16 w16cex w16sdtdh w16sdtfl w16du">
   <w:view w:val="normal"/>
   <w:defaultTabStop w:val="720"/>
   <w:characterSpacingControl w:val="doNotCompress"/>
@@ -24760,11 +24776,13 @@
     <w:rsid w:val="00652A77"/>
     <w:rsid w:val="00703846"/>
     <w:rsid w:val="007A5859"/>
+    <w:rsid w:val="007D585A"/>
     <w:rsid w:val="008F7A2D"/>
     <w:rsid w:val="00916B06"/>
     <w:rsid w:val="0096263D"/>
     <w:rsid w:val="0096434B"/>
     <w:rsid w:val="00BD4939"/>
+    <w:rsid w:val="00CB62E7"/>
     <w:rsid w:val="00D2156A"/>
     <w:rsid w:val="00D5796E"/>
     <w:rsid w:val="00D62A5D"/>
@@ -24801,7 +24819,7 @@
 </file>
 
 <file path=word/glossary/styles.xml><?xml version="1.0" encoding="utf-8"?>
-<w:styles xmlns:mc="http://schemas.openxmlformats.org/markup-compatibility/2006" xmlns:r="http://schemas.openxmlformats.org/officeDocument/2006/relationships" xmlns:w="http://schemas.openxmlformats.org/wordprocessingml/2006/main" xmlns:w14="http://schemas.microsoft.com/office/word/2010/wordml" xmlns:w15="http://schemas.microsoft.com/office/word/2012/wordml" xmlns:w16cex="http://schemas.microsoft.com/office/word/2018/wordml/cex" xmlns:w16cid="http://schemas.microsoft.com/office/word/2016/wordml/cid" xmlns:w16="http://schemas.microsoft.com/office/word/2018/wordml" xmlns:w16sdtdh="http://schemas.microsoft.com/office/word/2020/wordml/sdtdatahash" xmlns:w16se="http://schemas.microsoft.com/office/word/2015/wordml/symex" mc:Ignorable="w14 w15 w16se w16cid w16 w16cex w16sdtdh">
+<w:styles xmlns:mc="http://schemas.openxmlformats.org/markup-compatibility/2006" xmlns:r="http://schemas.openxmlformats.org/officeDocument/2006/relationships" xmlns:w="http://schemas.openxmlformats.org/wordprocessingml/2006/main" xmlns:w14="http://schemas.microsoft.com/office/word/2010/wordml" xmlns:w15="http://schemas.microsoft.com/office/word/2012/wordml" xmlns:w16cex="http://schemas.microsoft.com/office/word/2018/wordml/cex" xmlns:w16cid="http://schemas.microsoft.com/office/word/2016/wordml/cid" xmlns:w16="http://schemas.microsoft.com/office/word/2018/wordml" xmlns:w16du="http://schemas.microsoft.com/office/word/2023/wordml/word16du" xmlns:w16sdtdh="http://schemas.microsoft.com/office/word/2020/wordml/sdtdatahash" xmlns:w16sdtfl="http://schemas.microsoft.com/office/word/2024/wordml/sdtformatlock" xmlns:w16se="http://schemas.microsoft.com/office/word/2015/wordml/symex" mc:Ignorable="w14 w15 w16se w16cid w16 w16cex w16sdtdh w16sdtfl w16du">
   <w:docDefaults>
     <w:rPrDefault>
       <w:rPr>
@@ -25252,7 +25270,7 @@
 </file>
 
 <file path=word/glossary/webSettings.xml><?xml version="1.0" encoding="utf-8"?>
-<w:webSettings xmlns:mc="http://schemas.openxmlformats.org/markup-compatibility/2006" xmlns:r="http://schemas.openxmlformats.org/officeDocument/2006/relationships" xmlns:w="http://schemas.openxmlformats.org/wordprocessingml/2006/main" xmlns:w14="http://schemas.microsoft.com/office/word/2010/wordml" xmlns:w15="http://schemas.microsoft.com/office/word/2012/wordml" xmlns:w16cex="http://schemas.microsoft.com/office/word/2018/wordml/cex" xmlns:w16cid="http://schemas.microsoft.com/office/word/2016/wordml/cid" xmlns:w16="http://schemas.microsoft.com/office/word/2018/wordml" xmlns:w16sdtdh="http://schemas.microsoft.com/office/word/2020/wordml/sdtdatahash" xmlns:w16se="http://schemas.microsoft.com/office/word/2015/wordml/symex" mc:Ignorable="w14 w15 w16se w16cid w16 w16cex w16sdtdh">
+<w:webSettings xmlns:mc="http://schemas.openxmlformats.org/markup-compatibility/2006" xmlns:r="http://schemas.openxmlformats.org/officeDocument/2006/relationships" xmlns:w="http://schemas.openxmlformats.org/wordprocessingml/2006/main" xmlns:w14="http://schemas.microsoft.com/office/word/2010/wordml" xmlns:w15="http://schemas.microsoft.com/office/word/2012/wordml" xmlns:w16cex="http://schemas.microsoft.com/office/word/2018/wordml/cex" xmlns:w16cid="http://schemas.microsoft.com/office/word/2016/wordml/cid" xmlns:w16="http://schemas.microsoft.com/office/word/2018/wordml" xmlns:w16du="http://schemas.microsoft.com/office/word/2023/wordml/word16du" xmlns:w16sdtdh="http://schemas.microsoft.com/office/word/2020/wordml/sdtdatahash" xmlns:w16sdtfl="http://schemas.microsoft.com/office/word/2024/wordml/sdtformatlock" xmlns:w16se="http://schemas.microsoft.com/office/word/2015/wordml/symex" mc:Ignorable="w14 w15 w16se w16cid w16 w16cex w16sdtdh w16sdtfl w16du">
   <w:optimizeForBrowser/>
   <w:allowPNG/>
 </w:webSettings>
@@ -25531,16 +25549,16 @@
 </file>
 
 <file path=customXml/item2.xml><?xml version="1.0" encoding="utf-8"?>
+<b:Sources xmlns:b="http://schemas.openxmlformats.org/officeDocument/2006/bibliography" xmlns="http://schemas.openxmlformats.org/officeDocument/2006/bibliography" SelectedStyle="\APASixthEditionOfficeOnline.xsl" StyleName="APA" Version="6"/>
+</file>
+
+<file path=customXml/item3.xml><?xml version="1.0" encoding="utf-8"?>
 <?mso-contentType ?>
 <FormTemplates xmlns="http://schemas.microsoft.com/sharepoint/v3/contenttype/forms">
   <Display>DocumentLibraryForm</Display>
   <Edit>AssetEditForm</Edit>
   <New>DocumentLibraryForm</New>
 </FormTemplates>
-</file>
-
-<file path=customXml/item3.xml><?xml version="1.0" encoding="utf-8"?>
-<b:Sources xmlns:b="http://schemas.openxmlformats.org/officeDocument/2006/bibliography" xmlns="http://schemas.openxmlformats.org/officeDocument/2006/bibliography" SelectedStyle="\APASixthEditionOfficeOnline.xsl" StyleName="APA" Version="6"/>
 </file>
 
 <file path=customXml/itemProps1.xml><?xml version="1.0" encoding="utf-8"?>
@@ -25552,17 +25570,17 @@
 </file>
 
 <file path=customXml/itemProps2.xml><?xml version="1.0" encoding="utf-8"?>
+<ds:datastoreItem xmlns:ds="http://schemas.openxmlformats.org/officeDocument/2006/customXml" ds:itemID="{2C6368D3-6B43-48CE-BD00-292DECF52435}">
+  <ds:schemaRefs>
+    <ds:schemaRef ds:uri="http://schemas.openxmlformats.org/officeDocument/2006/bibliography"/>
+  </ds:schemaRefs>
+</ds:datastoreItem>
+</file>
+
+<file path=customXml/itemProps3.xml><?xml version="1.0" encoding="utf-8"?>
 <ds:datastoreItem xmlns:ds="http://schemas.openxmlformats.org/officeDocument/2006/customXml" ds:itemID="{499EA1EC-B023-4266-9865-E1EDA122A8C9}">
   <ds:schemaRefs>
     <ds:schemaRef ds:uri="http://schemas.microsoft.com/sharepoint/v3/contenttype/forms"/>
   </ds:schemaRefs>
 </ds:datastoreItem>
-</file>
-
-<file path=customXml/itemProps3.xml><?xml version="1.0" encoding="utf-8"?>
-<ds:datastoreItem xmlns:ds="http://schemas.openxmlformats.org/officeDocument/2006/customXml" ds:itemID="{2C6368D3-6B43-48CE-BD00-292DECF52435}">
-  <ds:schemaRefs>
-    <ds:schemaRef ds:uri="http://schemas.openxmlformats.org/officeDocument/2006/bibliography"/>
-  </ds:schemaRefs>
-</ds:datastoreItem>
 </file>
</xml_diff>